<commit_message>
Small updates - fixes
</commit_message>
<xml_diff>
--- a/Diplomski rad - dokumentacija.docx
+++ b/Diplomski rad - dokumentacija.docx
@@ -296,7 +296,7 @@
       </w:tr>
       <w:tr>
         <w:trPr>
-          <w:trHeight w:val="5001" w:hRule="atLeast"/>
+          <w:trHeight w:val="4464" w:hRule="atLeast"/>
         </w:trPr>
         <w:tc>
           <w:tcPr>
@@ -432,7 +432,7 @@
                 <w:szCs w:val="32"/>
                 <w:lang w:val="sr-RS" w:eastAsia="en-US" w:bidi="en-US"/>
               </w:rPr>
-              <w:t>Maj 2026.</w:t>
+              <w:t>Септембар 2026.</w:t>
             </w:r>
           </w:p>
         </w:tc>
@@ -476,9 +476,7 @@
               <w:tab w:val="clear" w:pos="720"/>
               <w:tab w:val="right" w:pos="9025" w:leader="dot"/>
             </w:tabs>
-            <w:rPr>
-              <w:lang w:val="sr-RS"/>
-            </w:rPr>
+            <w:rPr/>
           </w:pPr>
           <w:r>
             <w:fldChar w:fldCharType="begin"/>
@@ -486,27 +484,27 @@
           <w:r>
             <w:rPr>
               <w:rStyle w:val="IndexLink"/>
-              <w:lang w:val="sr-RS"/>
+              <w:vanish w:val="false"/>
             </w:rPr>
             <w:instrText xml:space="preserve"> TOC \z \o "1-3" \u \h</w:instrText>
           </w:r>
           <w:r>
             <w:rPr>
               <w:rStyle w:val="IndexLink"/>
-              <w:lang w:val="sr-RS"/>
+              <w:vanish w:val="false"/>
             </w:rPr>
             <w:fldChar w:fldCharType="separate"/>
           </w:r>
           <w:r>
             <w:rPr>
               <w:rStyle w:val="IndexLink"/>
-              <w:lang w:val="sr-RS"/>
+              <w:vanish w:val="false"/>
             </w:rPr>
             <w:t>1. Увод</w:t>
           </w:r>
           <w:r>
             <w:rPr>
-              <w:lang w:val="sr-RS"/>
+              <w:vanish w:val="false"/>
             </w:rPr>
             <w:tab/>
             <w:t>5</w:t>
@@ -519,13 +517,11 @@
               <w:tab w:val="clear" w:pos="720"/>
               <w:tab w:val="right" w:pos="9025" w:leader="dot"/>
             </w:tabs>
-            <w:rPr>
-              <w:lang w:val="sr-RS"/>
-            </w:rPr>
+            <w:rPr/>
           </w:pPr>
           <w:r>
             <w:rPr>
-              <w:lang w:val="sr-RS"/>
+              <w:vanish w:val="false"/>
             </w:rPr>
             <w:t>1.1. Мотивација истраживања</w:t>
             <w:tab/>
@@ -539,13 +535,11 @@
               <w:tab w:val="clear" w:pos="720"/>
               <w:tab w:val="right" w:pos="9025" w:leader="dot"/>
             </w:tabs>
-            <w:rPr>
-              <w:lang w:val="sr-RS"/>
-            </w:rPr>
+            <w:rPr/>
           </w:pPr>
           <w:r>
             <w:rPr>
-              <w:lang w:val="sr-RS"/>
+              <w:vanish w:val="false"/>
             </w:rPr>
             <w:t>1.2. Проблем истраживања</w:t>
             <w:tab/>
@@ -559,13 +553,11 @@
               <w:tab w:val="clear" w:pos="720"/>
               <w:tab w:val="right" w:pos="9025" w:leader="dot"/>
             </w:tabs>
-            <w:rPr>
-              <w:lang w:val="sr-RS"/>
-            </w:rPr>
+            <w:rPr/>
           </w:pPr>
           <w:r>
             <w:rPr>
-              <w:lang w:val="sr-RS"/>
+              <w:vanish w:val="false"/>
             </w:rPr>
             <w:t>1.3. Циљ рада</w:t>
             <w:tab/>
@@ -579,13 +571,11 @@
               <w:tab w:val="clear" w:pos="720"/>
               <w:tab w:val="right" w:pos="9025" w:leader="dot"/>
             </w:tabs>
-            <w:rPr>
-              <w:lang w:val="sr-RS"/>
-            </w:rPr>
+            <w:rPr/>
           </w:pPr>
           <w:r>
             <w:rPr>
-              <w:lang w:val="sr-RS"/>
+              <w:vanish w:val="false"/>
             </w:rPr>
             <w:t>1.4. Истраживачка питања и хипотезе</w:t>
             <w:tab/>
@@ -599,13 +589,11 @@
               <w:tab w:val="clear" w:pos="720"/>
               <w:tab w:val="right" w:pos="9025" w:leader="dot"/>
             </w:tabs>
-            <w:rPr>
-              <w:lang w:val="sr-RS"/>
-            </w:rPr>
+            <w:rPr/>
           </w:pPr>
           <w:r>
             <w:rPr>
-              <w:lang w:val="sr-RS"/>
+              <w:vanish w:val="false"/>
             </w:rPr>
             <w:t>1.5. Структура рада</w:t>
             <w:tab/>
@@ -619,13 +607,11 @@
               <w:tab w:val="clear" w:pos="720"/>
               <w:tab w:val="right" w:pos="9025" w:leader="dot"/>
             </w:tabs>
-            <w:rPr>
-              <w:lang w:val="sr-RS"/>
-            </w:rPr>
+            <w:rPr/>
           </w:pPr>
           <w:r>
             <w:rPr>
-              <w:lang w:val="sr-RS"/>
+              <w:vanish w:val="false"/>
             </w:rPr>
             <w:t>2. Теоријски оквир</w:t>
             <w:tab/>
@@ -639,13 +625,11 @@
               <w:tab w:val="clear" w:pos="720"/>
               <w:tab w:val="right" w:pos="9025" w:leader="dot"/>
             </w:tabs>
-            <w:rPr>
-              <w:lang w:val="sr-RS"/>
-            </w:rPr>
+            <w:rPr/>
           </w:pPr>
           <w:r>
             <w:rPr>
-              <w:lang w:val="sr-RS"/>
+              <w:vanish w:val="false"/>
             </w:rPr>
             <w:t>2.1. Фактори који утичу на СТЕМ опредељење ученика</w:t>
             <w:tab/>
@@ -659,13 +643,11 @@
               <w:tab w:val="clear" w:pos="720"/>
               <w:tab w:val="right" w:pos="9025" w:leader="dot"/>
             </w:tabs>
-            <w:rPr>
-              <w:lang w:val="sr-RS"/>
-            </w:rPr>
+            <w:rPr/>
           </w:pPr>
           <w:r>
             <w:rPr>
-              <w:lang w:val="sr-RS"/>
+              <w:vanish w:val="false"/>
             </w:rPr>
             <w:t>2.2. Машинско учење у образовној аналитици</w:t>
             <w:tab/>
@@ -679,13 +661,11 @@
               <w:tab w:val="clear" w:pos="720"/>
               <w:tab w:val="right" w:pos="9025" w:leader="dot"/>
             </w:tabs>
-            <w:rPr>
-              <w:lang w:val="sr-RS"/>
-            </w:rPr>
+            <w:rPr/>
           </w:pPr>
           <w:r>
             <w:rPr>
-              <w:lang w:val="sr-RS"/>
+              <w:vanish w:val="false"/>
             </w:rPr>
             <w:t>2.3. Алгоритми машинског учења коришћени у раду</w:t>
             <w:tab/>
@@ -699,13 +679,11 @@
               <w:tab w:val="clear" w:pos="720"/>
               <w:tab w:val="right" w:pos="9025" w:leader="dot"/>
             </w:tabs>
-            <w:rPr>
-              <w:lang w:val="sr-RS"/>
-            </w:rPr>
+            <w:rPr/>
           </w:pPr>
           <w:r>
             <w:rPr>
-              <w:lang w:val="sr-RS"/>
+              <w:vanish w:val="false"/>
             </w:rPr>
             <w:t>2.3.1. Логистичка регресија</w:t>
             <w:tab/>
@@ -719,13 +697,11 @@
               <w:tab w:val="clear" w:pos="720"/>
               <w:tab w:val="right" w:pos="9025" w:leader="dot"/>
             </w:tabs>
-            <w:rPr>
-              <w:lang w:val="sr-RS"/>
-            </w:rPr>
+            <w:rPr/>
           </w:pPr>
           <w:r>
             <w:rPr>
-              <w:lang w:val="sr-RS"/>
+              <w:vanish w:val="false"/>
             </w:rPr>
             <w:t>2.3.2. K-Nearest Neighbors (KNN)</w:t>
             <w:tab/>
@@ -739,13 +715,11 @@
               <w:tab w:val="clear" w:pos="720"/>
               <w:tab w:val="right" w:pos="9025" w:leader="dot"/>
             </w:tabs>
-            <w:rPr>
-              <w:lang w:val="sr-RS"/>
-            </w:rPr>
+            <w:rPr/>
           </w:pPr>
           <w:r>
             <w:rPr>
-              <w:lang w:val="sr-RS"/>
+              <w:vanish w:val="false"/>
             </w:rPr>
             <w:t>2.3.3. Support Vector Machine (SVM)</w:t>
             <w:tab/>
@@ -759,13 +733,11 @@
               <w:tab w:val="clear" w:pos="720"/>
               <w:tab w:val="right" w:pos="9025" w:leader="dot"/>
             </w:tabs>
-            <w:rPr>
-              <w:lang w:val="sr-RS"/>
-            </w:rPr>
+            <w:rPr/>
           </w:pPr>
           <w:r>
             <w:rPr>
-              <w:lang w:val="sr-RS"/>
+              <w:vanish w:val="false"/>
             </w:rPr>
             <w:t>2.3.4. Random Forest</w:t>
             <w:tab/>
@@ -779,13 +751,11 @@
               <w:tab w:val="clear" w:pos="720"/>
               <w:tab w:val="right" w:pos="9025" w:leader="dot"/>
             </w:tabs>
-            <w:rPr>
-              <w:lang w:val="sr-RS"/>
-            </w:rPr>
+            <w:rPr/>
           </w:pPr>
           <w:r>
             <w:rPr>
-              <w:lang w:val="sr-RS"/>
+              <w:vanish w:val="false"/>
             </w:rPr>
             <w:t>2.3.5. XGBoost</w:t>
             <w:tab/>
@@ -799,13 +769,11 @@
               <w:tab w:val="clear" w:pos="720"/>
               <w:tab w:val="right" w:pos="9025" w:leader="dot"/>
             </w:tabs>
-            <w:rPr>
-              <w:lang w:val="sr-RS"/>
-            </w:rPr>
+            <w:rPr/>
           </w:pPr>
           <w:r>
             <w:rPr>
-              <w:lang w:val="sr-RS"/>
+              <w:vanish w:val="false"/>
             </w:rPr>
             <w:t>2.4. Методе интерпретације модела</w:t>
             <w:tab/>
@@ -819,13 +787,11 @@
               <w:tab w:val="clear" w:pos="720"/>
               <w:tab w:val="right" w:pos="9025" w:leader="dot"/>
             </w:tabs>
-            <w:rPr>
-              <w:lang w:val="sr-RS"/>
-            </w:rPr>
+            <w:rPr/>
           </w:pPr>
           <w:r>
             <w:rPr>
-              <w:lang w:val="sr-RS"/>
+              <w:vanish w:val="false"/>
             </w:rPr>
             <w:t>2.4.1. Интерпретација коефицијената логистичке регресије</w:t>
             <w:tab/>
@@ -839,13 +805,11 @@
               <w:tab w:val="clear" w:pos="720"/>
               <w:tab w:val="right" w:pos="9025" w:leader="dot"/>
             </w:tabs>
-            <w:rPr>
-              <w:lang w:val="sr-RS"/>
-            </w:rPr>
+            <w:rPr/>
           </w:pPr>
           <w:r>
             <w:rPr>
-              <w:lang w:val="sr-RS"/>
+              <w:vanish w:val="false"/>
             </w:rPr>
             <w:t>2.4.2. Значај обележја код ансамбл модела</w:t>
             <w:tab/>
@@ -859,15 +823,31 @@
               <w:tab w:val="clear" w:pos="720"/>
               <w:tab w:val="right" w:pos="9025" w:leader="dot"/>
             </w:tabs>
-            <w:rPr>
-              <w:lang w:val="sr-RS"/>
-            </w:rPr>
+            <w:rPr/>
           </w:pPr>
           <w:r>
             <w:rPr>
-              <w:lang w:val="sr-RS"/>
+              <w:vanish w:val="false"/>
             </w:rPr>
             <w:t>2.4.3. SHAP анализа</w:t>
+            <w:tab/>
+            <w:t>12</w:t>
+          </w:r>
+        </w:p>
+        <w:p>
+          <w:pPr>
+            <w:pStyle w:val="TOC2"/>
+            <w:tabs>
+              <w:tab w:val="clear" w:pos="720"/>
+              <w:tab w:val="right" w:pos="9025" w:leader="dot"/>
+            </w:tabs>
+            <w:rPr/>
+          </w:pPr>
+          <w:r>
+            <w:rPr>
+              <w:vanish w:val="false"/>
+            </w:rPr>
+            <w:t>2.5. Правичност машинских модела (fairness)</w:t>
             <w:tab/>
             <w:t>12</w:t>
           </w:r>
@@ -879,13 +859,11 @@
               <w:tab w:val="clear" w:pos="720"/>
               <w:tab w:val="right" w:pos="9025" w:leader="dot"/>
             </w:tabs>
-            <w:rPr>
-              <w:lang w:val="sr-RS"/>
-            </w:rPr>
+            <w:rPr/>
           </w:pPr>
           <w:r>
             <w:rPr>
-              <w:lang w:val="sr-RS"/>
+              <w:vanish w:val="false"/>
             </w:rPr>
             <w:t>3. Скуп података</w:t>
             <w:tab/>
@@ -899,13 +877,11 @@
               <w:tab w:val="clear" w:pos="720"/>
               <w:tab w:val="right" w:pos="9025" w:leader="dot"/>
             </w:tabs>
-            <w:rPr>
-              <w:lang w:val="sr-RS"/>
-            </w:rPr>
+            <w:rPr/>
           </w:pPr>
           <w:r>
             <w:rPr>
-              <w:lang w:val="sr-RS"/>
+              <w:vanish w:val="false"/>
             </w:rPr>
             <w:t>3.1. Порекло и начин прикупљања података</w:t>
             <w:tab/>
@@ -919,13 +895,11 @@
               <w:tab w:val="clear" w:pos="720"/>
               <w:tab w:val="right" w:pos="9025" w:leader="dot"/>
             </w:tabs>
-            <w:rPr>
-              <w:lang w:val="sr-RS"/>
-            </w:rPr>
+            <w:rPr/>
           </w:pPr>
           <w:r>
             <w:rPr>
-              <w:lang w:val="sr-RS"/>
+              <w:vanish w:val="false"/>
             </w:rPr>
             <w:t>3.2. Структура и димензије скупа података</w:t>
             <w:tab/>
@@ -939,13 +913,11 @@
               <w:tab w:val="clear" w:pos="720"/>
               <w:tab w:val="right" w:pos="9025" w:leader="dot"/>
             </w:tabs>
-            <w:rPr>
-              <w:lang w:val="sr-RS"/>
-            </w:rPr>
+            <w:rPr/>
           </w:pPr>
           <w:r>
             <w:rPr>
-              <w:lang w:val="sr-RS"/>
+              <w:vanish w:val="false"/>
             </w:rPr>
             <w:t>3.3. Типови обележја</w:t>
             <w:tab/>
@@ -959,13 +931,11 @@
               <w:tab w:val="clear" w:pos="720"/>
               <w:tab w:val="right" w:pos="9025" w:leader="dot"/>
             </w:tabs>
-            <w:rPr>
-              <w:lang w:val="sr-RS"/>
-            </w:rPr>
+            <w:rPr/>
           </w:pPr>
           <w:r>
             <w:rPr>
-              <w:lang w:val="sr-RS"/>
+              <w:vanish w:val="false"/>
             </w:rPr>
             <w:t>3.4. Дефинисање циљне променљиве (СТЕМ vs. НЕ-СТЕМ)</w:t>
             <w:tab/>
@@ -979,13 +949,11 @@
               <w:tab w:val="clear" w:pos="720"/>
               <w:tab w:val="right" w:pos="9025" w:leader="dot"/>
             </w:tabs>
-            <w:rPr>
-              <w:lang w:val="sr-RS"/>
-            </w:rPr>
+            <w:rPr/>
           </w:pPr>
           <w:r>
             <w:rPr>
-              <w:lang w:val="sr-RS"/>
+              <w:vanish w:val="false"/>
             </w:rPr>
             <w:t>3.5. Расподела циљне променљиве (баланс класа)</w:t>
             <w:tab/>
@@ -999,13 +967,11 @@
               <w:tab w:val="clear" w:pos="720"/>
               <w:tab w:val="right" w:pos="9025" w:leader="dot"/>
             </w:tabs>
-            <w:rPr>
-              <w:lang w:val="sr-RS"/>
-            </w:rPr>
+            <w:rPr/>
           </w:pPr>
           <w:r>
             <w:rPr>
-              <w:lang w:val="sr-RS"/>
+              <w:vanish w:val="false"/>
             </w:rPr>
             <w:t>3.6. Ограничења скупа података</w:t>
             <w:tab/>
@@ -1019,13 +985,11 @@
               <w:tab w:val="clear" w:pos="720"/>
               <w:tab w:val="right" w:pos="9025" w:leader="dot"/>
             </w:tabs>
-            <w:rPr>
-              <w:lang w:val="sr-RS"/>
-            </w:rPr>
+            <w:rPr/>
           </w:pPr>
           <w:r>
             <w:rPr>
-              <w:lang w:val="sr-RS"/>
+              <w:vanish w:val="false"/>
             </w:rPr>
             <w:t>4. Експлораторна анализа података (ЕДА)</w:t>
             <w:tab/>
@@ -1039,13 +1003,11 @@
               <w:tab w:val="clear" w:pos="720"/>
               <w:tab w:val="right" w:pos="9025" w:leader="dot"/>
             </w:tabs>
-            <w:rPr>
-              <w:lang w:val="sr-RS"/>
-            </w:rPr>
+            <w:rPr/>
           </w:pPr>
           <w:r>
             <w:rPr>
-              <w:lang w:val="sr-RS"/>
+              <w:vanish w:val="false"/>
             </w:rPr>
             <w:t>4.1. Дескриптивна статистика нумеричких обележја</w:t>
             <w:tab/>
@@ -1059,13 +1021,11 @@
               <w:tab w:val="clear" w:pos="720"/>
               <w:tab w:val="right" w:pos="9025" w:leader="dot"/>
             </w:tabs>
-            <w:rPr>
-              <w:lang w:val="sr-RS"/>
-            </w:rPr>
+            <w:rPr/>
           </w:pPr>
           <w:r>
             <w:rPr>
-              <w:lang w:val="sr-RS"/>
+              <w:vanish w:val="false"/>
             </w:rPr>
             <w:t>4.2. Анализа категоријских обележја</w:t>
             <w:tab/>
@@ -1079,13 +1039,11 @@
               <w:tab w:val="clear" w:pos="720"/>
               <w:tab w:val="right" w:pos="9025" w:leader="dot"/>
             </w:tabs>
-            <w:rPr>
-              <w:lang w:val="sr-RS"/>
-            </w:rPr>
+            <w:rPr/>
           </w:pPr>
           <w:r>
             <w:rPr>
-              <w:lang w:val="sr-RS"/>
+              <w:vanish w:val="false"/>
             </w:rPr>
             <w:t>4.3. Графички приказ расподела</w:t>
             <w:tab/>
@@ -1099,13 +1057,11 @@
               <w:tab w:val="clear" w:pos="720"/>
               <w:tab w:val="right" w:pos="9025" w:leader="dot"/>
             </w:tabs>
-            <w:rPr>
-              <w:lang w:val="sr-RS"/>
-            </w:rPr>
+            <w:rPr/>
           </w:pPr>
           <w:r>
             <w:rPr>
-              <w:lang w:val="sr-RS"/>
+              <w:vanish w:val="false"/>
             </w:rPr>
             <w:t>4.4. Корелациона матрица</w:t>
             <w:tab/>
@@ -1119,13 +1075,11 @@
               <w:tab w:val="clear" w:pos="720"/>
               <w:tab w:val="right" w:pos="9025" w:leader="dot"/>
             </w:tabs>
-            <w:rPr>
-              <w:lang w:val="sr-RS"/>
-            </w:rPr>
+            <w:rPr/>
           </w:pPr>
           <w:r>
             <w:rPr>
-              <w:lang w:val="sr-RS"/>
+              <w:vanish w:val="false"/>
             </w:rPr>
             <w:t>4.5. Статистички тестови повезаности са циљном променљивом</w:t>
             <w:tab/>
@@ -1139,13 +1093,11 @@
               <w:tab w:val="clear" w:pos="720"/>
               <w:tab w:val="right" w:pos="9025" w:leader="dot"/>
             </w:tabs>
-            <w:rPr>
-              <w:lang w:val="sr-RS"/>
-            </w:rPr>
+            <w:rPr/>
           </w:pPr>
           <w:r>
             <w:rPr>
-              <w:lang w:val="sr-RS"/>
+              <w:vanish w:val="false"/>
             </w:rPr>
             <w:t>5. Припрема података</w:t>
             <w:tab/>
@@ -1159,13 +1111,11 @@
               <w:tab w:val="clear" w:pos="720"/>
               <w:tab w:val="right" w:pos="9025" w:leader="dot"/>
             </w:tabs>
-            <w:rPr>
-              <w:lang w:val="sr-RS"/>
-            </w:rPr>
+            <w:rPr/>
           </w:pPr>
           <w:r>
             <w:rPr>
-              <w:lang w:val="sr-RS"/>
+              <w:vanish w:val="false"/>
             </w:rPr>
             <w:t>5.1. Уклањање непотребних колона</w:t>
             <w:tab/>
@@ -1179,13 +1129,11 @@
               <w:tab w:val="clear" w:pos="720"/>
               <w:tab w:val="right" w:pos="9025" w:leader="dot"/>
             </w:tabs>
-            <w:rPr>
-              <w:lang w:val="sr-RS"/>
-            </w:rPr>
+            <w:rPr/>
           </w:pPr>
           <w:r>
             <w:rPr>
-              <w:lang w:val="sr-RS"/>
+              <w:vanish w:val="false"/>
             </w:rPr>
             <w:t>5.2. Обрада недостајућих вредности</w:t>
             <w:tab/>
@@ -1199,13 +1147,11 @@
               <w:tab w:val="clear" w:pos="720"/>
               <w:tab w:val="right" w:pos="9025" w:leader="dot"/>
             </w:tabs>
-            <w:rPr>
-              <w:lang w:val="sr-RS"/>
-            </w:rPr>
+            <w:rPr/>
           </w:pPr>
           <w:r>
             <w:rPr>
-              <w:lang w:val="sr-RS"/>
+              <w:vanish w:val="false"/>
             </w:rPr>
             <w:t>5.3. Детекција дупликата</w:t>
             <w:tab/>
@@ -1219,13 +1165,11 @@
               <w:tab w:val="clear" w:pos="720"/>
               <w:tab w:val="right" w:pos="9025" w:leader="dot"/>
             </w:tabs>
-            <w:rPr>
-              <w:lang w:val="sr-RS"/>
-            </w:rPr>
+            <w:rPr/>
           </w:pPr>
           <w:r>
             <w:rPr>
-              <w:lang w:val="sr-RS"/>
+              <w:vanish w:val="false"/>
             </w:rPr>
             <w:t>5.4. Детекција аномалија</w:t>
             <w:tab/>
@@ -1239,13 +1183,11 @@
               <w:tab w:val="clear" w:pos="720"/>
               <w:tab w:val="right" w:pos="9025" w:leader="dot"/>
             </w:tabs>
-            <w:rPr>
-              <w:lang w:val="sr-RS"/>
-            </w:rPr>
+            <w:rPr/>
           </w:pPr>
           <w:r>
             <w:rPr>
-              <w:lang w:val="sr-RS"/>
+              <w:vanish w:val="false"/>
             </w:rPr>
             <w:t>5.5. Енкодирање категоријских променљивих</w:t>
             <w:tab/>
@@ -1259,13 +1201,11 @@
               <w:tab w:val="clear" w:pos="720"/>
               <w:tab w:val="right" w:pos="9025" w:leader="dot"/>
             </w:tabs>
-            <w:rPr>
-              <w:lang w:val="sr-RS"/>
-            </w:rPr>
+            <w:rPr/>
           </w:pPr>
           <w:r>
             <w:rPr>
-              <w:lang w:val="sr-RS"/>
+              <w:vanish w:val="false"/>
             </w:rPr>
             <w:t>5.6. Подела скупа података (Stratified train-test split)</w:t>
             <w:tab/>
@@ -1279,13 +1219,11 @@
               <w:tab w:val="clear" w:pos="720"/>
               <w:tab w:val="right" w:pos="9025" w:leader="dot"/>
             </w:tabs>
-            <w:rPr>
-              <w:lang w:val="sr-RS"/>
-            </w:rPr>
+            <w:rPr/>
           </w:pPr>
           <w:r>
             <w:rPr>
-              <w:lang w:val="sr-RS"/>
+              <w:vanish w:val="false"/>
             </w:rPr>
             <w:t>5.7. Скалирање нумеричких обележја</w:t>
             <w:tab/>
@@ -1299,13 +1237,11 @@
               <w:tab w:val="clear" w:pos="720"/>
               <w:tab w:val="right" w:pos="9025" w:leader="dot"/>
             </w:tabs>
-            <w:rPr>
-              <w:lang w:val="sr-RS"/>
-            </w:rPr>
+            <w:rPr/>
           </w:pPr>
           <w:r>
             <w:rPr>
-              <w:lang w:val="sr-RS"/>
+              <w:vanish w:val="false"/>
             </w:rPr>
             <w:t>5.8. Селекција обележја</w:t>
             <w:tab/>
@@ -1319,13 +1255,11 @@
               <w:tab w:val="clear" w:pos="720"/>
               <w:tab w:val="right" w:pos="9025" w:leader="dot"/>
             </w:tabs>
-            <w:rPr>
-              <w:lang w:val="sr-RS"/>
-            </w:rPr>
+            <w:rPr/>
           </w:pPr>
           <w:r>
             <w:rPr>
-              <w:lang w:val="sr-RS"/>
+              <w:vanish w:val="false"/>
             </w:rPr>
             <w:t>6. Методологија развоја и евалуације модела</w:t>
             <w:tab/>
@@ -1339,13 +1273,11 @@
               <w:tab w:val="clear" w:pos="720"/>
               <w:tab w:val="right" w:pos="9025" w:leader="dot"/>
             </w:tabs>
-            <w:rPr>
-              <w:lang w:val="sr-RS"/>
-            </w:rPr>
+            <w:rPr/>
           </w:pPr>
           <w:r>
             <w:rPr>
-              <w:lang w:val="sr-RS"/>
+              <w:vanish w:val="false"/>
             </w:rPr>
             <w:t>6.1. Ток методологије анализе</w:t>
             <w:tab/>
@@ -1359,17 +1291,15 @@
               <w:tab w:val="clear" w:pos="720"/>
               <w:tab w:val="right" w:pos="9025" w:leader="dot"/>
             </w:tabs>
-            <w:rPr>
-              <w:lang w:val="sr-RS"/>
-            </w:rPr>
+            <w:rPr/>
           </w:pPr>
           <w:r>
             <w:rPr>
-              <w:lang w:val="sr-RS"/>
+              <w:vanish w:val="false"/>
             </w:rPr>
             <w:t>6.2. Стратегија валидације</w:t>
             <w:tab/>
-            <w:t>34</w:t>
+            <w:t>35</w:t>
           </w:r>
         </w:p>
         <w:p>
@@ -1379,13 +1309,11 @@
               <w:tab w:val="clear" w:pos="720"/>
               <w:tab w:val="right" w:pos="9025" w:leader="dot"/>
             </w:tabs>
-            <w:rPr>
-              <w:lang w:val="sr-RS"/>
-            </w:rPr>
+            <w:rPr/>
           </w:pPr>
           <w:r>
             <w:rPr>
-              <w:lang w:val="sr-RS"/>
+              <w:vanish w:val="false"/>
             </w:rPr>
             <w:t>6.3. Метрике евалуације</w:t>
             <w:tab/>
@@ -1399,13 +1327,11 @@
               <w:tab w:val="clear" w:pos="720"/>
               <w:tab w:val="right" w:pos="9025" w:leader="dot"/>
             </w:tabs>
-            <w:rPr>
-              <w:lang w:val="sr-RS"/>
-            </w:rPr>
+            <w:rPr/>
           </w:pPr>
           <w:r>
             <w:rPr>
-              <w:lang w:val="sr-RS"/>
+              <w:vanish w:val="false"/>
             </w:rPr>
             <w:t>6.3.1. Accuracy</w:t>
             <w:tab/>
@@ -1419,13 +1345,11 @@
               <w:tab w:val="clear" w:pos="720"/>
               <w:tab w:val="right" w:pos="9025" w:leader="dot"/>
             </w:tabs>
-            <w:rPr>
-              <w:lang w:val="sr-RS"/>
-            </w:rPr>
+            <w:rPr/>
           </w:pPr>
           <w:r>
             <w:rPr>
-              <w:lang w:val="sr-RS"/>
+              <w:vanish w:val="false"/>
             </w:rPr>
             <w:t>6.3.2. Precision</w:t>
             <w:tab/>
@@ -1439,13 +1363,11 @@
               <w:tab w:val="clear" w:pos="720"/>
               <w:tab w:val="right" w:pos="9025" w:leader="dot"/>
             </w:tabs>
-            <w:rPr>
-              <w:lang w:val="sr-RS"/>
-            </w:rPr>
+            <w:rPr/>
           </w:pPr>
           <w:r>
             <w:rPr>
-              <w:lang w:val="sr-RS"/>
+              <w:vanish w:val="false"/>
             </w:rPr>
             <w:t>6.3.3. Recall</w:t>
             <w:tab/>
@@ -1459,13 +1381,11 @@
               <w:tab w:val="clear" w:pos="720"/>
               <w:tab w:val="right" w:pos="9025" w:leader="dot"/>
             </w:tabs>
-            <w:rPr>
-              <w:lang w:val="sr-RS"/>
-            </w:rPr>
+            <w:rPr/>
           </w:pPr>
           <w:r>
             <w:rPr>
-              <w:lang w:val="sr-RS"/>
+              <w:vanish w:val="false"/>
             </w:rPr>
             <w:t>6.3.4. F-1 Score (Macro и Weighted)</w:t>
             <w:tab/>
@@ -1479,17 +1399,15 @@
               <w:tab w:val="clear" w:pos="720"/>
               <w:tab w:val="right" w:pos="9025" w:leader="dot"/>
             </w:tabs>
-            <w:rPr>
-              <w:lang w:val="sr-RS"/>
-            </w:rPr>
+            <w:rPr/>
           </w:pPr>
           <w:r>
             <w:rPr>
-              <w:lang w:val="sr-RS"/>
+              <w:vanish w:val="false"/>
             </w:rPr>
             <w:t>6.3.5. ROC-AUC</w:t>
             <w:tab/>
-            <w:t>35</w:t>
+            <w:t>36</w:t>
           </w:r>
         </w:p>
         <w:p>
@@ -1499,17 +1417,15 @@
               <w:tab w:val="clear" w:pos="720"/>
               <w:tab w:val="right" w:pos="9025" w:leader="dot"/>
             </w:tabs>
-            <w:rPr>
-              <w:lang w:val="sr-RS"/>
-            </w:rPr>
+            <w:rPr/>
           </w:pPr>
           <w:r>
             <w:rPr>
-              <w:lang w:val="sr-RS"/>
+              <w:vanish w:val="false"/>
             </w:rPr>
             <w:t>6.3.6. Confusion Matrix</w:t>
             <w:tab/>
-            <w:t>35</w:t>
+            <w:t>36</w:t>
           </w:r>
         </w:p>
         <w:p>
@@ -1519,13 +1435,11 @@
               <w:tab w:val="clear" w:pos="720"/>
               <w:tab w:val="right" w:pos="9025" w:leader="dot"/>
             </w:tabs>
-            <w:rPr>
-              <w:lang w:val="sr-RS"/>
-            </w:rPr>
+            <w:rPr/>
           </w:pPr>
           <w:r>
             <w:rPr>
-              <w:lang w:val="sr-RS"/>
+              <w:vanish w:val="false"/>
             </w:rPr>
             <w:t>6.4. Фино подешавање хиперпараметара</w:t>
             <w:tab/>
@@ -1539,13 +1453,11 @@
               <w:tab w:val="clear" w:pos="720"/>
               <w:tab w:val="right" w:pos="9025" w:leader="dot"/>
             </w:tabs>
-            <w:rPr>
-              <w:lang w:val="sr-RS"/>
-            </w:rPr>
+            <w:rPr/>
           </w:pPr>
           <w:r>
             <w:rPr>
-              <w:lang w:val="sr-RS"/>
+              <w:vanish w:val="false"/>
             </w:rPr>
             <w:t>6.4.1. GridSearchCV</w:t>
             <w:tab/>
@@ -1559,17 +1471,15 @@
               <w:tab w:val="clear" w:pos="720"/>
               <w:tab w:val="right" w:pos="9025" w:leader="dot"/>
             </w:tabs>
-            <w:rPr>
-              <w:lang w:val="sr-RS"/>
-            </w:rPr>
+            <w:rPr/>
           </w:pPr>
           <w:r>
             <w:rPr>
-              <w:lang w:val="sr-RS"/>
+              <w:vanish w:val="false"/>
             </w:rPr>
             <w:t>6.4.2. RandomizedSearchCV</w:t>
             <w:tab/>
-            <w:t>36</w:t>
+            <w:t>37</w:t>
           </w:r>
         </w:p>
         <w:p>
@@ -1579,17 +1489,15 @@
               <w:tab w:val="clear" w:pos="720"/>
               <w:tab w:val="right" w:pos="9025" w:leader="dot"/>
             </w:tabs>
-            <w:rPr>
-              <w:lang w:val="sr-RS"/>
-            </w:rPr>
+            <w:rPr/>
           </w:pPr>
           <w:r>
             <w:rPr>
-              <w:lang w:val="sr-RS"/>
+              <w:vanish w:val="false"/>
             </w:rPr>
             <w:t>6.5. Nested Cross-Validation</w:t>
             <w:tab/>
-            <w:t>36</w:t>
+            <w:t>37</w:t>
           </w:r>
         </w:p>
         <w:p>
@@ -1599,13 +1507,11 @@
               <w:tab w:val="clear" w:pos="720"/>
               <w:tab w:val="right" w:pos="9025" w:leader="dot"/>
             </w:tabs>
-            <w:rPr>
-              <w:lang w:val="sr-RS"/>
-            </w:rPr>
+            <w:rPr/>
           </w:pPr>
           <w:r>
             <w:rPr>
-              <w:lang w:val="sr-RS"/>
+              <w:vanish w:val="false"/>
             </w:rPr>
             <w:t>7. Резултати и компаративна анализа модела</w:t>
             <w:tab/>
@@ -1619,13 +1525,11 @@
               <w:tab w:val="clear" w:pos="720"/>
               <w:tab w:val="right" w:pos="9025" w:leader="dot"/>
             </w:tabs>
-            <w:rPr>
-              <w:lang w:val="sr-RS"/>
-            </w:rPr>
+            <w:rPr/>
           </w:pPr>
           <w:r>
             <w:rPr>
-              <w:lang w:val="sr-RS"/>
+              <w:vanish w:val="false"/>
             </w:rPr>
             <w:t>7.1. Baseline модел (Dummy Classifier)</w:t>
             <w:tab/>
@@ -1639,13 +1543,11 @@
               <w:tab w:val="clear" w:pos="720"/>
               <w:tab w:val="right" w:pos="9025" w:leader="dot"/>
             </w:tabs>
-            <w:rPr>
-              <w:lang w:val="sr-RS"/>
-            </w:rPr>
+            <w:rPr/>
           </w:pPr>
           <w:r>
             <w:rPr>
-              <w:lang w:val="sr-RS"/>
+              <w:vanish w:val="false"/>
             </w:rPr>
             <w:t>7.2. Резултати унакрсне валидације</w:t>
             <w:tab/>
@@ -1659,13 +1561,11 @@
               <w:tab w:val="clear" w:pos="720"/>
               <w:tab w:val="right" w:pos="9025" w:leader="dot"/>
             </w:tabs>
-            <w:rPr>
-              <w:lang w:val="sr-RS"/>
-            </w:rPr>
+            <w:rPr/>
           </w:pPr>
           <w:r>
             <w:rPr>
-              <w:lang w:val="sr-RS"/>
+              <w:vanish w:val="false"/>
             </w:rPr>
             <w:t>7.3. Резултати на тест скупу</w:t>
             <w:tab/>
@@ -1679,13 +1579,11 @@
               <w:tab w:val="clear" w:pos="720"/>
               <w:tab w:val="right" w:pos="9025" w:leader="dot"/>
             </w:tabs>
-            <w:rPr>
-              <w:lang w:val="sr-RS"/>
-            </w:rPr>
+            <w:rPr/>
           </w:pPr>
           <w:r>
             <w:rPr>
-              <w:lang w:val="sr-RS"/>
+              <w:vanish w:val="false"/>
             </w:rPr>
             <w:t>7.4. Упоредна анализа модела</w:t>
             <w:tab/>
@@ -1699,13 +1597,11 @@
               <w:tab w:val="clear" w:pos="720"/>
               <w:tab w:val="right" w:pos="9025" w:leader="dot"/>
             </w:tabs>
-            <w:rPr>
-              <w:lang w:val="sr-RS"/>
-            </w:rPr>
+            <w:rPr/>
           </w:pPr>
           <w:r>
             <w:rPr>
-              <w:lang w:val="sr-RS"/>
+              <w:vanish w:val="false"/>
             </w:rPr>
             <w:t>7.5. ROC криве</w:t>
             <w:tab/>
@@ -1719,13 +1615,11 @@
               <w:tab w:val="clear" w:pos="720"/>
               <w:tab w:val="right" w:pos="9025" w:leader="dot"/>
             </w:tabs>
-            <w:rPr>
-              <w:lang w:val="sr-RS"/>
-            </w:rPr>
+            <w:rPr/>
           </w:pPr>
           <w:r>
             <w:rPr>
-              <w:lang w:val="sr-RS"/>
+              <w:vanish w:val="false"/>
             </w:rPr>
             <w:t>7.6. Дискусија перформанси</w:t>
             <w:tab/>
@@ -1739,13 +1633,11 @@
               <w:tab w:val="clear" w:pos="720"/>
               <w:tab w:val="right" w:pos="9025" w:leader="dot"/>
             </w:tabs>
-            <w:rPr>
-              <w:lang w:val="sr-RS"/>
-            </w:rPr>
+            <w:rPr/>
           </w:pPr>
           <w:r>
             <w:rPr>
-              <w:lang w:val="sr-RS"/>
+              <w:vanish w:val="false"/>
             </w:rPr>
             <w:t>8. Интерпретабилност модела и анализа значаја обележја</w:t>
             <w:tab/>
@@ -1759,13 +1651,11 @@
               <w:tab w:val="clear" w:pos="720"/>
               <w:tab w:val="right" w:pos="9025" w:leader="dot"/>
             </w:tabs>
-            <w:rPr>
-              <w:lang w:val="sr-RS"/>
-            </w:rPr>
+            <w:rPr/>
           </w:pPr>
           <w:r>
             <w:rPr>
-              <w:lang w:val="sr-RS"/>
+              <w:vanish w:val="false"/>
             </w:rPr>
             <w:t>8.1. Коефицијенти логистичке регресије (Odds Ratio интерпретација)</w:t>
             <w:tab/>
@@ -1779,13 +1669,11 @@
               <w:tab w:val="clear" w:pos="720"/>
               <w:tab w:val="right" w:pos="9025" w:leader="dot"/>
             </w:tabs>
-            <w:rPr>
-              <w:lang w:val="sr-RS"/>
-            </w:rPr>
+            <w:rPr/>
           </w:pPr>
           <w:r>
             <w:rPr>
-              <w:lang w:val="sr-RS"/>
+              <w:vanish w:val="false"/>
             </w:rPr>
             <w:t>8.2. Feature importance (Random Forest, XGBoost)</w:t>
             <w:tab/>
@@ -1799,13 +1687,11 @@
               <w:tab w:val="clear" w:pos="720"/>
               <w:tab w:val="right" w:pos="9025" w:leader="dot"/>
             </w:tabs>
-            <w:rPr>
-              <w:lang w:val="sr-RS"/>
-            </w:rPr>
+            <w:rPr/>
           </w:pPr>
           <w:r>
             <w:rPr>
-              <w:lang w:val="sr-RS"/>
+              <w:vanish w:val="false"/>
             </w:rPr>
             <w:t>8.3. SHAP анализа</w:t>
             <w:tab/>
@@ -1819,13 +1705,11 @@
               <w:tab w:val="clear" w:pos="720"/>
               <w:tab w:val="right" w:pos="9025" w:leader="dot"/>
             </w:tabs>
-            <w:rPr>
-              <w:lang w:val="sr-RS"/>
-            </w:rPr>
+            <w:rPr/>
           </w:pPr>
           <w:r>
             <w:rPr>
-              <w:lang w:val="sr-RS"/>
+              <w:vanish w:val="false"/>
             </w:rPr>
             <w:t>8.4. Идентификација најзначајнијих предиктора СТЕМ опредељења</w:t>
             <w:tab/>
@@ -1839,13 +1723,11 @@
               <w:tab w:val="clear" w:pos="720"/>
               <w:tab w:val="right" w:pos="9025" w:leader="dot"/>
             </w:tabs>
-            <w:rPr>
-              <w:lang w:val="sr-RS"/>
-            </w:rPr>
+            <w:rPr/>
           </w:pPr>
           <w:r>
             <w:rPr>
-              <w:lang w:val="sr-RS"/>
+              <w:vanish w:val="false"/>
             </w:rPr>
             <w:t>9. Анализа правичности и робусности модела</w:t>
             <w:tab/>
@@ -1859,13 +1741,11 @@
               <w:tab w:val="clear" w:pos="720"/>
               <w:tab w:val="right" w:pos="9025" w:leader="dot"/>
             </w:tabs>
-            <w:rPr>
-              <w:lang w:val="sr-RS"/>
-            </w:rPr>
+            <w:rPr/>
           </w:pPr>
           <w:r>
             <w:rPr>
-              <w:lang w:val="sr-RS"/>
+              <w:vanish w:val="false"/>
             </w:rPr>
             <w:t>9.1. Перформансе модела по полу</w:t>
             <w:tab/>
@@ -1879,13 +1759,11 @@
               <w:tab w:val="clear" w:pos="720"/>
               <w:tab w:val="right" w:pos="9025" w:leader="dot"/>
             </w:tabs>
-            <w:rPr>
-              <w:lang w:val="sr-RS"/>
-            </w:rPr>
+            <w:rPr/>
           </w:pPr>
           <w:r>
             <w:rPr>
-              <w:lang w:val="sr-RS"/>
+              <w:vanish w:val="false"/>
             </w:rPr>
             <w:t>9.2. Анализа потенцијалног bias-а</w:t>
             <w:tab/>
@@ -1899,13 +1777,11 @@
               <w:tab w:val="clear" w:pos="720"/>
               <w:tab w:val="right" w:pos="9025" w:leader="dot"/>
             </w:tabs>
-            <w:rPr>
-              <w:lang w:val="sr-RS"/>
-            </w:rPr>
+            <w:rPr/>
           </w:pPr>
           <w:r>
             <w:rPr>
-              <w:lang w:val="sr-RS"/>
+              <w:vanish w:val="false"/>
             </w:rPr>
             <w:t>9.3. Анализа робусности (уклањање кључних предиктора)</w:t>
             <w:tab/>
@@ -1919,13 +1795,11 @@
               <w:tab w:val="clear" w:pos="720"/>
               <w:tab w:val="right" w:pos="9025" w:leader="dot"/>
             </w:tabs>
-            <w:rPr>
-              <w:lang w:val="sr-RS"/>
-            </w:rPr>
+            <w:rPr/>
           </w:pPr>
           <w:r>
             <w:rPr>
-              <w:lang w:val="sr-RS"/>
+              <w:vanish w:val="false"/>
             </w:rPr>
             <w:t>10. Дискусија резултата</w:t>
             <w:tab/>
@@ -1939,13 +1813,11 @@
               <w:tab w:val="clear" w:pos="720"/>
               <w:tab w:val="right" w:pos="9025" w:leader="dot"/>
             </w:tabs>
-            <w:rPr>
-              <w:lang w:val="sr-RS"/>
-            </w:rPr>
+            <w:rPr/>
           </w:pPr>
           <w:r>
             <w:rPr>
-              <w:lang w:val="sr-RS"/>
+              <w:vanish w:val="false"/>
             </w:rPr>
             <w:t>10.1. Одговори на истраживачка питања</w:t>
             <w:tab/>
@@ -1959,13 +1831,11 @@
               <w:tab w:val="clear" w:pos="720"/>
               <w:tab w:val="right" w:pos="9025" w:leader="dot"/>
             </w:tabs>
-            <w:rPr>
-              <w:lang w:val="sr-RS"/>
-            </w:rPr>
+            <w:rPr/>
           </w:pPr>
           <w:r>
             <w:rPr>
-              <w:lang w:val="sr-RS"/>
+              <w:vanish w:val="false"/>
             </w:rPr>
             <w:t>10.2. Главни допринос рада</w:t>
             <w:tab/>
@@ -1979,13 +1849,11 @@
               <w:tab w:val="clear" w:pos="720"/>
               <w:tab w:val="right" w:pos="9025" w:leader="dot"/>
             </w:tabs>
-            <w:rPr>
-              <w:lang w:val="sr-RS"/>
-            </w:rPr>
+            <w:rPr/>
           </w:pPr>
           <w:r>
             <w:rPr>
-              <w:lang w:val="sr-RS"/>
+              <w:vanish w:val="false"/>
             </w:rPr>
             <w:t>10.3. Практичне импликације</w:t>
             <w:tab/>
@@ -1999,13 +1867,11 @@
               <w:tab w:val="clear" w:pos="720"/>
               <w:tab w:val="right" w:pos="9025" w:leader="dot"/>
             </w:tabs>
-            <w:rPr>
-              <w:lang w:val="sr-RS"/>
-            </w:rPr>
+            <w:rPr/>
           </w:pPr>
           <w:r>
             <w:rPr>
-              <w:lang w:val="sr-RS"/>
+              <w:vanish w:val="false"/>
             </w:rPr>
             <w:t>10.4. Ограничења истраживања</w:t>
             <w:tab/>
@@ -2019,13 +1885,11 @@
               <w:tab w:val="clear" w:pos="720"/>
               <w:tab w:val="right" w:pos="9025" w:leader="dot"/>
             </w:tabs>
-            <w:rPr>
-              <w:lang w:val="sr-RS"/>
-            </w:rPr>
+            <w:rPr/>
           </w:pPr>
           <w:r>
             <w:rPr>
-              <w:lang w:val="sr-RS"/>
+              <w:vanish w:val="false"/>
             </w:rPr>
             <w:t>10.5. Правци будућих истраживања</w:t>
             <w:tab/>
@@ -2039,13 +1903,11 @@
               <w:tab w:val="clear" w:pos="720"/>
               <w:tab w:val="right" w:pos="9025" w:leader="dot"/>
             </w:tabs>
-            <w:rPr>
-              <w:lang w:val="sr-RS"/>
-            </w:rPr>
+            <w:rPr/>
           </w:pPr>
           <w:r>
             <w:rPr>
-              <w:lang w:val="sr-RS"/>
+              <w:vanish w:val="false"/>
             </w:rPr>
             <w:t>11. Закључак</w:t>
             <w:tab/>
@@ -2059,13 +1921,11 @@
               <w:tab w:val="clear" w:pos="720"/>
               <w:tab w:val="right" w:pos="9025" w:leader="dot"/>
             </w:tabs>
-            <w:rPr>
-              <w:lang w:val="sr-RS"/>
-            </w:rPr>
+            <w:rPr/>
           </w:pPr>
           <w:r>
             <w:rPr>
-              <w:lang w:val="sr-RS"/>
+              <w:vanish w:val="false"/>
             </w:rPr>
             <w:t>Литература</w:t>
             <w:tab/>
@@ -2079,21 +1939,19 @@
               <w:tab w:val="clear" w:pos="720"/>
               <w:tab w:val="right" w:pos="9025" w:leader="dot"/>
             </w:tabs>
-            <w:rPr>
-              <w:lang w:val="sr-RS"/>
-            </w:rPr>
+            <w:rPr/>
           </w:pPr>
           <w:r>
             <w:rPr>
-              <w:lang w:val="sr-RS"/>
+              <w:vanish w:val="false"/>
             </w:rPr>
             <w:t>Кратка биографија кандидата</w:t>
             <w:tab/>
-            <w:t>54</w:t>
+            <w:t>55</w:t>
           </w:r>
           <w:r>
             <w:rPr>
-              <w:lang w:val="sr-RS"/>
+              <w:vanish w:val="false"/>
             </w:rPr>
             <w:fldChar w:fldCharType="end"/>
           </w:r>
@@ -2171,7 +2029,7 @@
         <w:rPr>
           <w:lang w:val="sr-RS"/>
         </w:rPr>
-        <w:t>Избор образовног смера представља комплексан процес на који утичу бројни фактори укључујућу лична интересовања, академско самопоуздање, претходно искуство, као и социјалне и демографске карактеристике. Разумевање тих фактора од посебног је значаја за образовне институције, јер омогућава правовремено професионално усмеравање и осмишљавање циљаних интервенција.</w:t>
+        <w:t>Избор образовног смера представља комплексан процес на који утичу бројни фактори укључујући лична интересовања, академско самопоуздање, претходно искуство, као и социјалне и демографске карактеристике. Разумевање тих фактора од посебног је значаја за образовне институције, јер омогућава правовремено професионално усмеравање и осмишљавање циљаних интервенција.</w:t>
       </w:r>
     </w:p>
     <w:p>
@@ -2757,7 +2615,7 @@
         <w:rPr>
           <w:lang w:val="sr-RS"/>
         </w:rPr>
-        <w:t>Опредељење ученика за наставак образовања у областима науке, технологије, инжењерства и математике (СТЕМ) преставља сложен процес на који утиче више различитих фактора. У литератури се наводи да интересовање ученика за СТЕМ области није условљено само њиховим академским способностима, већ и читавим низом индивидуалних, социо-демографских и образовних карактеристика.</w:t>
+        <w:t>Опредељење ученика за наставак образовања у областима науке, технологије, инжењерства и математике (СТЕМ) представља сложен процес на који утиче више различитих фактора. У литератури се наводи да интересовање ученика за СТЕМ области није условљено само њиховим академским способностима, већ и читавим низом индивидуалних, социо-демографских и образовних карактеристика [1].</w:t>
       </w:r>
     </w:p>
     <w:p>
@@ -2785,7 +2643,7 @@
         <w:rPr>
           <w:lang w:val="sr-RS"/>
         </w:rPr>
-        <w:t>, посебно успех из предмета који су блиско повезани са СТЕМ областима, као што су математика, физика и информатике. Ученици који постижу боље резултате из ових предмета чешће показују веће самопоуздање у сопствене способности и већи интерес за наставак школовања у сродним областима. Истраживања показују да академска постигнућа могу значајно утицати на формирање академских и професионалних аспирација ученика.</w:t>
+        <w:t>, посебно успех из предмета који су блиско повезани са СТЕМ областима, као што су математика, физика и информатика. Ученици који постижу боље резултате из ових предмета чешће показују веће самопоуздање у сопствене способности и већи интерес за наставак школовања у сродним областима. Истраживања показују да академска постигнућа могу значајно утицати на формирање академских и професионалних аспирација ученика.</w:t>
       </w:r>
     </w:p>
     <w:p>
@@ -2841,7 +2699,7 @@
         <w:rPr>
           <w:lang w:val="sr-RS"/>
         </w:rPr>
-        <w:t>Учешће у радионицама, пројектима, такмичењима или другим облицима ваннаставних активности може допринети развоју интересовања за ове области. Кроз практичне активности ученици добијају прилику да стекну директно искуство у решавању проблема и примени научних и технолошких знања, што може позитивно утицати на њихову мотивацију за даље образовање у СТЕМ областима.</w:t>
+        <w:t>Учешће у радионицама, пројектима, такмичењима или другим облицима ваннаставних активности може допринети развоју интересовања за ове области. Кроз практичне активности ученици добијају прилику да стекну директно искуство у решавању проблема и примени научних и технолошких знања, што може позитивно утицати на њихову мотивацију за даље образовање у СТЕМ областима [2].</w:t>
       </w:r>
     </w:p>
     <w:p>
@@ -2869,7 +2727,7 @@
         <w:rPr>
           <w:lang w:val="sr-RS"/>
         </w:rPr>
-        <w:t>, као што су пол, породично окружење и социо-економски статус. На пример, бројна истраживања указују на постојање родних разлика у интересовању за СТЕМ области, при чему се у појединим дисциплинама бележи већа заступљеност ученика мушког пола. Међутим, савремена истраживања настоје на идентификују факторе који могу допринети смањењу ових разлика и подстицању већег укључивања ученица у СТЕМ области.</w:t>
+        <w:t>, као што су пол, породично окружење и социо-економски статус. На пример, бројна истраживања указују на постојање родних разлика у интересовању за СТЕМ области, при чему се у појединим дисциплинама бележи већа заступљеност ученика мушког пола. Међутим, савремена истраживања настоје да идентификују факторе који могу допринети смањењу ових разлика и подстицању већег укључивања ученица у СТЕМ области [1].</w:t>
       </w:r>
     </w:p>
     <w:p>
@@ -2962,21 +2820,21 @@
         <w:rPr>
           <w:lang w:val="sr-RS"/>
         </w:rPr>
-        <w:t>, која се бави применом различитих статистичких и рачунарских метора у анализи података из образовног окружења.</w:t>
-      </w:r>
-    </w:p>
-    <w:p>
-      <w:pPr>
-        <w:pStyle w:val="Style8"/>
-        <w:rPr>
-          <w:lang w:val="sr-RS"/>
-        </w:rPr>
-      </w:pPr>
-      <w:r>
-        <w:rPr>
-          <w:lang w:val="sr-RS"/>
-        </w:rPr>
-        <w:t>Један од најзначајнијих приступа у оквиру образовне аналитике представља примена метода машинског учења. Машинско учење обухвата скуп алгоритама који омогућавају рачунарским системима да на основу постојећих података препознају обрасце и креирају моделе који се могу користити за предвиђање будућих исхода. За ралику од традиционалних статистичких метода, алфоритми машинског учења могу ефикасно да обрађују велике и комлексне скупове података, као и да идентификују сложене и нелинеарне односе између различитих променљивих.</w:t>
+        <w:t>, која се бави применом различитих статистичких и рачунарских метода у анализи података из образовног окружења [3].</w:t>
+      </w:r>
+    </w:p>
+    <w:p>
+      <w:pPr>
+        <w:pStyle w:val="Style8"/>
+        <w:rPr>
+          <w:lang w:val="sr-RS"/>
+        </w:rPr>
+      </w:pPr>
+      <w:r>
+        <w:rPr>
+          <w:lang w:val="sr-RS"/>
+        </w:rPr>
+        <w:t>Један од најзначајнијих приступа у оквиру образовне аналитике представља примена метода машинског учења. Машинско учење обухвата скуп алгоритама који омогућавају рачунарским системима да на основу постојећих података препознају обрасце и креирају моделе који се могу користити за предвиђање будућих исхода. За разлику од традиционалних статистичких метода, алгоритми машинског учења могу ефикасно да обрађују велике и комплексне скупове података, као и да идентификују сложене и нелинеарне односе између различитих променљивих.</w:t>
       </w:r>
     </w:p>
     <w:p>
@@ -3004,21 +2862,21 @@
         <w:rPr>
           <w:lang w:val="sr-RS"/>
         </w:rPr>
-        <w:t>У контексту истраживања интересовања ученика за СТЕМ области, методе машинског учења омогућавају анализу великог броја потенцијалних фактора који могу утицати на образовне изборе ученика. Користећи податке о академским резултатима, ставовима ученика, социо-демографским карактеристикама и претходним образовним искуствима, могуће је изградити моделе који предвиђају вероватноћу да ће учених показати интересовање за СТЕМ области.</w:t>
-      </w:r>
-    </w:p>
-    <w:p>
-      <w:pPr>
-        <w:pStyle w:val="Style8"/>
-        <w:rPr>
-          <w:lang w:val="sr-RS"/>
-        </w:rPr>
-      </w:pPr>
-      <w:r>
-        <w:rPr>
-          <w:lang w:val="sr-RS"/>
-        </w:rPr>
-        <w:t>Предност примене машинског учења у оваквим истраживањима огледа се и у могућности идентификације најзначајнијих предиктора који утичу на посматрани исход. На тај начин се, поред саме предикције, добијају и вредне информације о факторима који највише доприносе формирању интересовања ученика за одређене образовне области. Оби резултати могу бити корисни наставницима, школама и доносиоцима образовних политика у креирању стратегија које подстичу веће интересовање ученика за СТЕМ области.</w:t>
+        <w:t>У контексту истраживања интересовања ученика за СТЕМ области, методе машинског учења омогућавају анализу великог броја потенцијалних фактора који могу утицати на образовне изборе ученика. Користећи податке о академским резултатима, ставовима ученика, социо-демографским карактеристикама и претходним образовним искуствима, могуће је изградити моделе који предвиђају вероватноћу да ће ученик показати интересовање за СТЕМ области.</w:t>
+      </w:r>
+    </w:p>
+    <w:p>
+      <w:pPr>
+        <w:pStyle w:val="Style8"/>
+        <w:rPr>
+          <w:lang w:val="sr-RS"/>
+        </w:rPr>
+      </w:pPr>
+      <w:r>
+        <w:rPr>
+          <w:lang w:val="sr-RS"/>
+        </w:rPr>
+        <w:t>Предност примене машинског учења у оваквим истраживањима огледа се и у могућности идентификације најзначајнијих предиктора који утичу на посматрани исход. На тај начин се, поред саме предикције, добијају и вредне информације о факторима који највише доприносе формирању интересовања ученика за одређене образовне области. Ови резултати могу бити корисни наставницима, школама и доносиоцима образовних политика у креирању стратегија које подстичу веће интересовање ученика за СТЕМ области.</w:t>
       </w:r>
     </w:p>
     <w:p>
@@ -3106,7 +2964,7 @@
         <w:rPr>
           <w:lang w:val="sr-RS"/>
         </w:rPr>
-        <w:t>Логистичка регресија представља један од најчешће коришћених алгоритама за решавање проблема бинарне класификације. Основна идеја овог модела је да се процени вероватноћа припадности посматране јединице одређеној класи на основу вредности независних променљивих.</w:t>
+        <w:t>Логистичка регресија представља један од најчешће коришћених алгоритама за решавање проблема бинарне класификације. Основна идеја овог модела је да се процени вероватноћа припадности посматране јединице одређеној класи на основу вредности независних променљивих [4].</w:t>
       </w:r>
     </w:p>
     <w:p>
@@ -3483,7 +3341,7 @@
         <w:rPr>
           <w:lang w:val="sr-RS"/>
         </w:rPr>
-        <w:t>Алгоритам К-најближих суседа (К-Nearest Neighbors) представља једноставан али ефикасан метод класификације заснован на принципу сличности између посматраних параметара. Основна идеја алгоритма је да се нова опсервације класификује на основу класа њених најближих суседа у простору обележја.</w:t>
+        <w:t>Алгоритам К-најближих суседа (К-Nearest Neighbors) представља једноставан али ефикасан метод класификације заснован на принципу сличности између посматраних параметара. Основна идеја алгоритма је да се нова опсервације класификује на основу класа њених најближих суседа у простору обележја [5].</w:t>
       </w:r>
     </w:p>
     <w:p>
@@ -3576,7 +3434,7 @@
         <w:rPr>
           <w:lang w:val="sr-RS"/>
         </w:rPr>
-        <w:t>Support Vector Machine (SVM) представља снажан алгоритам машинског учења који се користи за класификацију и регресију. Основна идеја овог алгоритма је проналажење хиперравни која најбоље раздваја податке који припадају различитим класама.</w:t>
+        <w:t>Support Vector Machine (SVM) представља снажан алгоритам машинског учења који се користи за класификацију и регресију. Основна идеја овог алгоритма је проналажење хиперравни која најбоље раздваја податке који припадају различитим класама [6].</w:t>
       </w:r>
     </w:p>
     <w:p>
@@ -3683,7 +3541,7 @@
         <w:rPr>
           <w:lang w:val="sr-RS"/>
         </w:rPr>
-        <w:t>Random Forest преставља ансамбл метод машинског учења који се заснива на изградњи већег броја одлучујућих стабала (decision trees). Основна идеја овог приступа је да се више модела комбинује како би се добила стабилнија и прецизнија предикција.</w:t>
+        <w:t>Random Forest представља ансамбл метод машинског учења који се заснива на изградњи већег броја одлучујућих стабала (decision trees). Основна идеја овог приступа је да се више модела комбинује како би се добила стабилнија и прецизнија предикција [7].</w:t>
       </w:r>
     </w:p>
     <w:p>
@@ -3804,7 +3662,7 @@
         <w:rPr>
           <w:lang w:val="sr-RS"/>
         </w:rPr>
-        <w:t>За разлику од bagging приступа који користи Random Forest, бустинг алгоритми граде моделе секвенцијално, тако што сваки нови модел покушава да исправи грешке претходних модела.</w:t>
+        <w:t>За разлику од bagging приступа који користи Random Forest, бустинг алгоритми граде моделе секвенцијално, тако што сваки нови модел покушава да исправи грешке претходних модела [8].</w:t>
       </w:r>
     </w:p>
     <w:p>
@@ -4002,7 +3860,7 @@
         <w:rPr>
           <w:lang w:val="sr-RS"/>
         </w:rPr>
-        <w:t>Једна од предности логистичке регресије јесте релативно једноставна интерпретација параметара модела. Коефицијенти логистичке регресије престављају процену утицаја сваког обележја на логаритам односа вероватноћа припадности одређеној класи.</w:t>
+        <w:t>Једна од предности логистичке регресије јесте релативно једноставна интерпретација параметара модела. Коефицијенти логистичке регресије представљају процену утицаја сваког обележја на логаритам односа вероватноћа припадности одређеној класи.</w:t>
       </w:r>
     </w:p>
     <w:p>
@@ -4030,7 +3888,7 @@
         <w:rPr>
           <w:lang w:val="sr-RS"/>
         </w:rPr>
-        <w:t xml:space="preserve"> вредности. Odds ratio представља однос вероватноћа да ће се догађај десити у присуству одређене променљиве у односу на ситуацију када та променљива није присутна. Вредност odds ratio већа од један указује на повећање вероватноће припадности посматраној класи, док вредност мања од један указује на смањење те вероватноће.</w:t>
+        <w:t xml:space="preserve"> вредности. Odds ratio представља однос вероватноћа да ће се догађај десити у присуству одређене променљиве у односу на ситуацију када та променљива није присутна. Вредност odds ratio већа од један указује на повећање вероватноће припадности посматраној класи, док вредност мања од један указује на смањење те вероватноће [4].</w:t>
       </w:r>
     </w:p>
     <w:p>
@@ -4095,21 +3953,21 @@
         <w:rPr>
           <w:lang w:val="sr-RS"/>
         </w:rPr>
-        <w:t xml:space="preserve"> представља квантитативну процену доприноса сваког обележја у процесу изградње модела.</w:t>
-      </w:r>
-    </w:p>
-    <w:p>
-      <w:pPr>
-        <w:pStyle w:val="Style8"/>
-        <w:rPr>
-          <w:lang w:val="sr-RS"/>
-        </w:rPr>
-      </w:pPr>
-      <w:r>
-        <w:rPr>
-          <w:lang w:val="sr-RS"/>
-        </w:rPr>
-        <w:t>Код ових алгоритама значај обележја се најчешче одређује на основу смањења мере нечистоће (impurity) приликом грађења стабала одлучивања. Обележја која доводе до већег смањења нечистоће сматрају се значајнијим за процес класификације.</w:t>
+        <w:t xml:space="preserve"> представља квантитативну процену доприноса сваког обележја у процесу изградње модела [7].</w:t>
+      </w:r>
+    </w:p>
+    <w:p>
+      <w:pPr>
+        <w:pStyle w:val="Style8"/>
+        <w:rPr>
+          <w:lang w:val="sr-RS"/>
+        </w:rPr>
+      </w:pPr>
+      <w:r>
+        <w:rPr>
+          <w:lang w:val="sr-RS"/>
+        </w:rPr>
+        <w:t>Код ових алгоритама значај обележја се најчешће одређује на основу смањења мере нечистоће (impurity) приликом грађења стабала одлучивања. Обележја која доводе до већег смањења нечистоће сматрају се значајнијим за процес класификације.</w:t>
       </w:r>
     </w:p>
     <w:p>
@@ -4160,7 +4018,7 @@
         <w:rPr>
           <w:lang w:val="sr-RS"/>
         </w:rPr>
-        <w:t>SHAP (SHapley Additive exPlanations) представља савремену методу за интерпретацију модела машинског учења која се заснива на концеприма из теорије игара. Основна идеја SHAP приступа је да се сваком обележју додели вредност која представља његов допринос коначној предикцији модела.</w:t>
+        <w:t>SHAP (SHapley Additive exPlanations) представља савремену методу за интерпретацију модела машинског учења која се заснива на концептима из теорије игара. Основна идеја SHAP приступа је да се сваком обележју додели вредност која представља његов допринос коначној предикцији модела [9].</w:t>
       </w:r>
     </w:p>
     <w:p>
@@ -4217,6 +4075,55 @@
           <w:lang w:val="sr-RS"/>
         </w:rPr>
         <w:t>Примена SHAP анализе омогућава дубље разумевање рада сложених модела машинског учења и представља важан корак у интерпретацији резултата добијених применом ових метода.</w:t>
+      </w:r>
+    </w:p>
+    <w:p>
+      <w:pPr>
+        <w:pStyle w:val="Style6"/>
+        <w:numPr>
+          <w:ilvl w:val="1"/>
+          <w:numId w:val="1"/>
+        </w:numPr>
+        <w:ind w:hanging="567" w:left="567"/>
+        <w:rPr>
+          <w:lang w:val="sr-RS"/>
+        </w:rPr>
+      </w:pPr>
+      <w:bookmarkStart w:id="38" w:name="__RefHeading___TocFairness"/>
+      <w:bookmarkEnd w:id="38"/>
+      <w:r>
+        <w:rPr>
+          <w:lang w:val="sr-RS"/>
+        </w:rPr>
+        <w:t>Правичност машинских модела (fairness)</w:t>
+      </w:r>
+    </w:p>
+    <w:p>
+      <w:pPr>
+        <w:pStyle w:val="Style8"/>
+        <w:rPr>
+          <w:lang w:val="sr-RS"/>
+        </w:rPr>
+      </w:pPr>
+      <w:r>
+        <w:rPr>
+          <w:lang w:val="sr-RS"/>
+        </w:rPr>
+        <w:t>Поред тачности предикције, у савременим истраживањима машинског учења све већу пажњу привлачи и питање правичности (fairness) модела — да ли модел подједнако добро предвиђа исход за различите подгрупе унутар посматраног скупа, на пример по полу или социодемографском пореклу, или систематски греши више код неких подгрупа него код других [10].</w:t>
+      </w:r>
+    </w:p>
+    <w:p>
+      <w:pPr>
+        <w:pStyle w:val="Style8"/>
+        <w:rPr>
+          <w:lang w:val="sr-RS"/>
+        </w:rPr>
+      </w:pPr>
+      <w:r>
+        <w:rPr>
+          <w:lang w:val="sr-RS"/>
+        </w:rPr>
+        <w:t>Правичност се не своди на укупну тачност модела: модел може остварити висок просечан резултат, а истовремено показивати неуједначене перформансе међу подгрупама, посебно ако су те подгрупе неуравнотежено заступљене у подацима. Анализа правичности зато типично упоређује метрике евалуације, на пример тачност и стопу лажно позитивних и лажно негативних предикција, између подгрупа, уз опрез да уочене разлике могу одражавати стварне разлике присутне у подацима, а не нужно пристрасност самог модела. У овом раду анализа правичности примењена је на резултате изабраног модела и приказана у поглављу 9.</w:t>
       </w:r>
     </w:p>
     <w:p>
@@ -4257,16 +4164,16 @@
           <w:lang w:val="sr-RS"/>
         </w:rPr>
       </w:pPr>
-      <w:bookmarkStart w:id="38" w:name="__RefHeading___Toc2309_1317292878"/>
-      <w:bookmarkStart w:id="39" w:name="_Toc225785080"/>
-      <w:bookmarkEnd w:id="38"/>
+      <w:bookmarkStart w:id="39" w:name="__RefHeading___Toc2309_1317292878"/>
+      <w:bookmarkStart w:id="40" w:name="_Toc225785080"/>
+      <w:bookmarkEnd w:id="39"/>
       <w:r>
         <w:rPr>
           <w:lang w:val="sr-RS"/>
         </w:rPr>
         <w:t>Скуп података</w:t>
       </w:r>
-      <w:bookmarkEnd w:id="39"/>
+      <w:bookmarkEnd w:id="40"/>
     </w:p>
     <w:p>
       <w:pPr>
@@ -4294,16 +4201,16 @@
           <w:lang w:val="sr-RS"/>
         </w:rPr>
       </w:pPr>
-      <w:bookmarkStart w:id="40" w:name="__RefHeading___Toc2311_1317292878"/>
-      <w:bookmarkStart w:id="41" w:name="_Toc225785081"/>
-      <w:bookmarkEnd w:id="40"/>
+      <w:bookmarkStart w:id="41" w:name="__RefHeading___Toc2311_1317292878"/>
+      <w:bookmarkStart w:id="42" w:name="_Toc225785081"/>
+      <w:bookmarkEnd w:id="41"/>
       <w:r>
         <w:rPr>
           <w:lang w:val="sr-RS"/>
         </w:rPr>
         <w:t>Порекло и начин прикупљања података</w:t>
       </w:r>
-      <w:bookmarkEnd w:id="41"/>
+      <w:bookmarkEnd w:id="42"/>
     </w:p>
     <w:p>
       <w:pPr>
@@ -4358,7 +4265,7 @@
         <w:rPr>
           <w:lang w:val="sr-RS"/>
         </w:rPr>
-        <w:t xml:space="preserve">Детаљан опис методологије прикупљања података и карактеристика узорка дат је у раду [1]. </w:t>
+        <w:t xml:space="preserve">Детаљан опис методологије прикупљања података и карактеристика узорка дат је у раду [11]. </w:t>
       </w:r>
     </w:p>
     <w:p>
@@ -4373,16 +4280,16 @@
           <w:lang w:val="sr-RS"/>
         </w:rPr>
       </w:pPr>
-      <w:bookmarkStart w:id="42" w:name="__RefHeading___Toc2313_1317292878"/>
-      <w:bookmarkStart w:id="43" w:name="_Toc225785082"/>
-      <w:bookmarkEnd w:id="42"/>
+      <w:bookmarkStart w:id="43" w:name="__RefHeading___Toc2313_1317292878"/>
+      <w:bookmarkStart w:id="44" w:name="_Toc225785082"/>
+      <w:bookmarkEnd w:id="43"/>
       <w:r>
         <w:rPr>
           <w:lang w:val="sr-RS"/>
         </w:rPr>
         <w:t>Структура и димензије скупа података</w:t>
       </w:r>
-      <w:bookmarkEnd w:id="43"/>
+      <w:bookmarkEnd w:id="44"/>
     </w:p>
     <w:p>
       <w:pPr>
@@ -4522,16 +4429,16 @@
           <w:lang w:val="sr-RS"/>
         </w:rPr>
       </w:pPr>
-      <w:bookmarkStart w:id="44" w:name="__RefHeading___Toc2315_1317292878"/>
-      <w:bookmarkStart w:id="45" w:name="_Toc225785083"/>
-      <w:bookmarkEnd w:id="44"/>
+      <w:bookmarkStart w:id="45" w:name="__RefHeading___Toc2315_1317292878"/>
+      <w:bookmarkStart w:id="46" w:name="_Toc225785083"/>
+      <w:bookmarkEnd w:id="45"/>
       <w:r>
         <w:rPr>
           <w:lang w:val="sr-RS"/>
         </w:rPr>
         <w:t>Типови обележја</w:t>
       </w:r>
-      <w:bookmarkEnd w:id="45"/>
+      <w:bookmarkEnd w:id="46"/>
     </w:p>
     <w:p>
       <w:pPr>
@@ -4566,7 +4473,7 @@
         <w:rPr>
           <w:lang w:val="sr-RS"/>
         </w:rPr>
-        <w:t xml:space="preserve"> представљају обележја чије вредности имају квантитавни карактер и могу се директно користити у математичким операцијама. У оквиру овог скупа података, нумеричка обележја обухватају, на пример, годину рођења ученика, број деце у породици, као и оцене из појединачних предмета у основној школи. Ова обележја могу бити дискретна (нпр. број деце у породици) или ординална по природи, али се у анализи често третирају као нумеричка због своје скале вредности.</w:t>
+        <w:t xml:space="preserve"> представљају обележја чије вредности имају квантитативни карактер и могу се директно користити у математичким операцијама. У оквиру овог скупа података, нумеричка обележја обухватају, на пример, годину рођења ученика, број деце у породици, као и оцене из појединачних предмета у основној школи. Ова обележја могу бити дискретна (нпр. број деце у породици) или ординална по природи, али се у анализи често третирају као нумеричка због своје скале вредности.</w:t>
       </w:r>
     </w:p>
     <w:p>
@@ -4659,16 +4566,16 @@
           <w:lang w:val="sr-RS"/>
         </w:rPr>
       </w:pPr>
-      <w:bookmarkStart w:id="46" w:name="__RefHeading___Toc2317_1317292878"/>
-      <w:bookmarkStart w:id="47" w:name="_Toc225785084"/>
-      <w:bookmarkEnd w:id="46"/>
+      <w:bookmarkStart w:id="47" w:name="__RefHeading___Toc2317_1317292878"/>
+      <w:bookmarkStart w:id="48" w:name="_Toc225785084"/>
+      <w:bookmarkEnd w:id="47"/>
       <w:r>
         <w:rPr>
           <w:lang w:val="sr-RS"/>
         </w:rPr>
         <w:t>Дефинисање циљне променљиве (СТЕМ vs. НЕ-СТЕМ)</w:t>
       </w:r>
-      <w:bookmarkEnd w:id="47"/>
+      <w:bookmarkEnd w:id="48"/>
     </w:p>
     <w:p>
       <w:pPr>
@@ -5032,16 +4939,16 @@
           <w:lang w:val="sr-RS"/>
         </w:rPr>
       </w:pPr>
-      <w:bookmarkStart w:id="48" w:name="__RefHeading___Toc2319_1317292878"/>
-      <w:bookmarkStart w:id="49" w:name="_Toc225785085"/>
-      <w:bookmarkEnd w:id="48"/>
+      <w:bookmarkStart w:id="49" w:name="__RefHeading___Toc2319_1317292878"/>
+      <w:bookmarkStart w:id="50" w:name="_Toc225785085"/>
+      <w:bookmarkEnd w:id="49"/>
       <w:r>
         <w:rPr>
           <w:lang w:val="sr-RS"/>
         </w:rPr>
         <w:t>Расподела циљне променљиве (баланс класа)</w:t>
       </w:r>
-      <w:bookmarkEnd w:id="49"/>
+      <w:bookmarkEnd w:id="50"/>
     </w:p>
     <w:p>
       <w:pPr>
@@ -5245,7 +5152,7 @@
           <w:lang w:val="sr-RS"/>
         </w:rPr>
       </w:pPr>
-      <w:bookmarkStart w:id="50" w:name="_Ref239559400"/>
+      <w:bookmarkStart w:id="51" w:name="_Ref239559400"/>
       <w:r>
         <w:rPr>
           <w:lang w:val="sr-RS"/>
@@ -5282,7 +5189,7 @@
         </w:rPr>
         <w:fldChar w:fldCharType="end"/>
       </w:r>
-      <w:bookmarkEnd w:id="50"/>
+      <w:bookmarkEnd w:id="51"/>
       <w:r>
         <w:rPr>
           <w:lang w:val="sr-RS"/>
@@ -5316,16 +5223,16 @@
           <w:lang w:val="sr-RS"/>
         </w:rPr>
       </w:pPr>
-      <w:bookmarkStart w:id="51" w:name="__RefHeading___Toc2321_1317292878"/>
-      <w:bookmarkStart w:id="52" w:name="_Toc225785086"/>
-      <w:bookmarkEnd w:id="51"/>
+      <w:bookmarkStart w:id="52" w:name="__RefHeading___Toc2321_1317292878"/>
+      <w:bookmarkStart w:id="53" w:name="_Toc225785086"/>
+      <w:bookmarkEnd w:id="52"/>
       <w:r>
         <w:rPr>
           <w:lang w:val="sr-RS"/>
         </w:rPr>
         <w:t>Ограничења скупа података</w:t>
       </w:r>
-      <w:bookmarkEnd w:id="52"/>
+      <w:bookmarkEnd w:id="53"/>
     </w:p>
     <w:p>
       <w:pPr>
@@ -5532,16 +5439,16 @@
           <w:lang w:val="sr-RS"/>
         </w:rPr>
       </w:pPr>
-      <w:bookmarkStart w:id="53" w:name="__RefHeading___Toc2323_1317292878"/>
-      <w:bookmarkStart w:id="54" w:name="_Toc225785087"/>
-      <w:bookmarkEnd w:id="53"/>
+      <w:bookmarkStart w:id="54" w:name="__RefHeading___Toc2323_1317292878"/>
+      <w:bookmarkStart w:id="55" w:name="_Toc225785087"/>
+      <w:bookmarkEnd w:id="54"/>
       <w:r>
         <w:rPr>
           <w:lang w:val="sr-RS"/>
         </w:rPr>
         <w:t>Експлораторна анализа података (ЕДА)</w:t>
       </w:r>
-      <w:bookmarkEnd w:id="54"/>
+      <w:bookmarkEnd w:id="55"/>
     </w:p>
     <w:p>
       <w:pPr>
@@ -5583,16 +5490,16 @@
           <w:lang w:val="sr-RS"/>
         </w:rPr>
       </w:pPr>
-      <w:bookmarkStart w:id="55" w:name="__RefHeading___Toc2325_1317292878"/>
-      <w:bookmarkStart w:id="56" w:name="_Toc225785088"/>
-      <w:bookmarkEnd w:id="55"/>
+      <w:bookmarkStart w:id="56" w:name="__RefHeading___Toc2325_1317292878"/>
+      <w:bookmarkStart w:id="57" w:name="_Toc225785088"/>
+      <w:bookmarkEnd w:id="56"/>
       <w:r>
         <w:rPr>
           <w:lang w:val="sr-RS"/>
         </w:rPr>
         <w:t>Дескриптивна статистика нумеричких обележја</w:t>
       </w:r>
-      <w:bookmarkEnd w:id="56"/>
+      <w:bookmarkEnd w:id="57"/>
     </w:p>
     <w:p>
       <w:pPr>
@@ -5703,7 +5610,7 @@
           <w:lang w:val="sr-RS"/>
         </w:rPr>
       </w:pPr>
-      <w:bookmarkStart w:id="57" w:name="_Ref239600001"/>
+      <w:bookmarkStart w:id="58" w:name="_Ref239600001"/>
       <w:r>
         <w:rPr>
           <w:lang w:val="sr-RS"/>
@@ -5740,7 +5647,7 @@
         </w:rPr>
         <w:fldChar w:fldCharType="end"/>
       </w:r>
-      <w:bookmarkEnd w:id="57"/>
+      <w:bookmarkEnd w:id="58"/>
       <w:r>
         <w:rPr>
           <w:lang w:val="sr-RS"/>
@@ -5977,7 +5884,7 @@
           <w:lang w:val="sr-RS"/>
         </w:rPr>
       </w:pPr>
-      <w:bookmarkStart w:id="58" w:name="_Ref239560518"/>
+      <w:bookmarkStart w:id="59" w:name="_Ref239560518"/>
       <w:r>
         <w:rPr>
           <w:lang w:val="sr-RS"/>
@@ -6014,7 +5921,7 @@
         </w:rPr>
         <w:fldChar w:fldCharType="end"/>
       </w:r>
-      <w:bookmarkEnd w:id="58"/>
+      <w:bookmarkEnd w:id="59"/>
       <w:r>
         <w:rPr>
           <w:lang w:val="sr-RS"/>
@@ -6084,16 +5991,16 @@
           <w:lang w:val="sr-RS"/>
         </w:rPr>
       </w:pPr>
-      <w:bookmarkStart w:id="59" w:name="__RefHeading___Toc2327_1317292878"/>
-      <w:bookmarkStart w:id="60" w:name="_Toc225785089"/>
-      <w:bookmarkEnd w:id="59"/>
+      <w:bookmarkStart w:id="60" w:name="__RefHeading___Toc2327_1317292878"/>
+      <w:bookmarkStart w:id="61" w:name="_Toc225785089"/>
+      <w:bookmarkEnd w:id="60"/>
       <w:r>
         <w:rPr>
           <w:lang w:val="sr-RS"/>
         </w:rPr>
         <w:t>Анализа категоријских обележја</w:t>
       </w:r>
-      <w:bookmarkEnd w:id="60"/>
+      <w:bookmarkEnd w:id="61"/>
     </w:p>
     <w:p>
       <w:pPr>
@@ -6254,7 +6161,7 @@
           <w:lang w:val="sr-RS"/>
         </w:rPr>
       </w:pPr>
-      <w:bookmarkStart w:id="61" w:name="_Ref239600002"/>
+      <w:bookmarkStart w:id="62" w:name="_Ref239600002"/>
       <w:r>
         <w:rPr>
           <w:lang w:val="sr-RS"/>
@@ -6291,7 +6198,7 @@
         </w:rPr>
         <w:fldChar w:fldCharType="end"/>
       </w:r>
-      <w:bookmarkEnd w:id="61"/>
+      <w:bookmarkEnd w:id="62"/>
       <w:r>
         <w:rPr>
           <w:lang w:val="sr-RS"/>
@@ -6579,7 +6486,7 @@
           <w:lang w:val="sr-RS"/>
         </w:rPr>
       </w:r>
-      <w:bookmarkStart w:id="62" w:name="_Toc225785090"/>
+      <w:bookmarkStart w:id="63" w:name="_Toc225785090"/>
       <w:r>
         <w:br w:type="page"/>
       </w:r>
@@ -6597,15 +6504,15 @@
           <w:lang w:val="sr-RS"/>
         </w:rPr>
       </w:pPr>
-      <w:bookmarkStart w:id="63" w:name="__RefHeading___Toc2329_1317292878"/>
+      <w:bookmarkStart w:id="64" w:name="__RefHeading___Toc2329_1317292878"/>
+      <w:bookmarkEnd w:id="64"/>
+      <w:r>
+        <w:rPr>
+          <w:lang w:val="sr-RS"/>
+        </w:rPr>
+        <w:t>Графички приказ расподела</w:t>
+      </w:r>
       <w:bookmarkEnd w:id="63"/>
-      <w:r>
-        <w:rPr>
-          <w:lang w:val="sr-RS"/>
-        </w:rPr>
-        <w:t>Графички приказ расподела</w:t>
-      </w:r>
-      <w:bookmarkEnd w:id="62"/>
     </w:p>
     <w:p>
       <w:pPr>
@@ -6669,7 +6576,7 @@
           <w:lang w:val="sr-RS"/>
         </w:rPr>
       </w:pPr>
-      <w:bookmarkStart w:id="64" w:name="_Ref239600014"/>
+      <w:bookmarkStart w:id="65" w:name="_Ref239600014"/>
       <w:r>
         <w:rPr>
           <w:lang w:val="sr-RS"/>
@@ -6706,7 +6613,7 @@
         </w:rPr>
         <w:fldChar w:fldCharType="end"/>
       </w:r>
-      <w:bookmarkEnd w:id="64"/>
+      <w:bookmarkEnd w:id="65"/>
       <w:r>
         <w:rPr>
           <w:lang w:val="sr-RS"/>
@@ -6837,7 +6744,7 @@
           <w:lang w:val="sr-RS"/>
         </w:rPr>
       </w:pPr>
-      <w:bookmarkStart w:id="65" w:name="_Ref239600005"/>
+      <w:bookmarkStart w:id="66" w:name="_Ref239600005"/>
       <w:r>
         <w:rPr>
           <w:lang w:val="sr-RS"/>
@@ -6874,7 +6781,7 @@
         </w:rPr>
         <w:fldChar w:fldCharType="end"/>
       </w:r>
-      <w:bookmarkEnd w:id="65"/>
+      <w:bookmarkEnd w:id="66"/>
       <w:r>
         <w:rPr>
           <w:lang w:val="sr-RS"/>
@@ -6977,7 +6884,7 @@
         </w:rPr>
         <w:tab/>
       </w:r>
-      <w:bookmarkStart w:id="66" w:name="_Ref239600006"/>
+      <w:bookmarkStart w:id="67" w:name="_Ref239600006"/>
       <w:r>
         <w:rPr>
           <w:lang w:val="sr-RS"/>
@@ -7014,7 +6921,7 @@
         </w:rPr>
         <w:fldChar w:fldCharType="end"/>
       </w:r>
-      <w:bookmarkEnd w:id="66"/>
+      <w:bookmarkEnd w:id="67"/>
       <w:r>
         <w:rPr>
           <w:lang w:val="sr-RS"/>
@@ -7265,7 +7172,7 @@
           <w:lang w:val="sr-RS"/>
         </w:rPr>
       </w:pPr>
-      <w:bookmarkStart w:id="67" w:name="_Ref239600007"/>
+      <w:bookmarkStart w:id="68" w:name="_Ref239600007"/>
       <w:r>
         <w:rPr>
           <w:lang w:val="sr-RS"/>
@@ -7302,7 +7209,7 @@
         </w:rPr>
         <w:fldChar w:fldCharType="end"/>
       </w:r>
-      <w:bookmarkEnd w:id="67"/>
+      <w:bookmarkEnd w:id="68"/>
       <w:r>
         <w:rPr>
           <w:lang w:val="sr-RS"/>
@@ -7420,7 +7327,7 @@
           <w:lang w:val="sr-RS"/>
         </w:rPr>
       </w:pPr>
-      <w:bookmarkStart w:id="68" w:name="_Ref239600008"/>
+      <w:bookmarkStart w:id="69" w:name="_Ref239600008"/>
       <w:r>
         <w:rPr>
           <w:lang w:val="sr-RS"/>
@@ -7457,7 +7364,7 @@
         </w:rPr>
         <w:fldChar w:fldCharType="end"/>
       </w:r>
-      <w:bookmarkEnd w:id="68"/>
+      <w:bookmarkEnd w:id="69"/>
       <w:r>
         <w:rPr>
           <w:lang w:val="sr-RS"/>
@@ -7575,7 +7482,7 @@
           <w:lang w:val="sr-RS"/>
         </w:rPr>
       </w:pPr>
-      <w:bookmarkStart w:id="69" w:name="_Ref239600009"/>
+      <w:bookmarkStart w:id="70" w:name="_Ref239600009"/>
       <w:r>
         <w:rPr>
           <w:lang w:val="sr-RS"/>
@@ -7612,7 +7519,7 @@
         </w:rPr>
         <w:fldChar w:fldCharType="end"/>
       </w:r>
-      <w:bookmarkEnd w:id="69"/>
+      <w:bookmarkEnd w:id="70"/>
       <w:r>
         <w:rPr>
           <w:lang w:val="sr-RS"/>
@@ -7745,7 +7652,7 @@
           <w:lang w:val="sr-RS"/>
         </w:rPr>
       </w:pPr>
-      <w:bookmarkStart w:id="70" w:name="_Ref239600010"/>
+      <w:bookmarkStart w:id="71" w:name="_Ref239600010"/>
       <w:r>
         <w:rPr>
           <w:lang w:val="sr-RS"/>
@@ -7782,7 +7689,7 @@
         </w:rPr>
         <w:fldChar w:fldCharType="end"/>
       </w:r>
-      <w:bookmarkEnd w:id="70"/>
+      <w:bookmarkEnd w:id="71"/>
       <w:r>
         <w:rPr>
           <w:lang w:val="sr-RS"/>
@@ -7852,16 +7759,16 @@
           <w:lang w:val="sr-RS"/>
         </w:rPr>
       </w:pPr>
-      <w:bookmarkStart w:id="71" w:name="__RefHeading___Toc2331_1317292878"/>
-      <w:bookmarkStart w:id="72" w:name="_Toc225785091"/>
-      <w:bookmarkEnd w:id="71"/>
+      <w:bookmarkStart w:id="72" w:name="__RefHeading___Toc2331_1317292878"/>
+      <w:bookmarkStart w:id="73" w:name="_Toc225785091"/>
+      <w:bookmarkEnd w:id="72"/>
       <w:r>
         <w:rPr>
           <w:lang w:val="sr-RS"/>
         </w:rPr>
         <w:t>Корелациона матрица</w:t>
       </w:r>
-      <w:bookmarkEnd w:id="72"/>
+      <w:bookmarkEnd w:id="73"/>
     </w:p>
     <w:p>
       <w:pPr>
@@ -7875,7 +7782,7 @@
         <w:rPr>
           <w:lang w:val="sr-RS"/>
         </w:rPr>
-        <w:t>У циљу испитивања међусобне повезаности нумеричких обележја, израчуната је корелациона матрица за одабране променљиве које се односе на оцене ученика, перцепцију занимљивости и тежине предмета, као и припадност СТЕМ или НЕ-СТЕМ групи.</w:t>
+        <w:t>У циљу испитивања међусобне повезаности нумеричких обележја, израчуната је Спирманова корелациона матрица за одабране променљиве које се односе на оцене ученика, перцепцију занимљивости и тежине предмета, као и припадност СТЕМ или НЕ-СТЕМ групи.</w:t>
       </w:r>
       <w:r>
         <w:rPr/>
@@ -7927,7 +7834,7 @@
           <w:lang w:val="sr-RS"/>
         </w:rPr>
       </w:pPr>
-      <w:bookmarkStart w:id="73" w:name="_Ref239600011"/>
+      <w:bookmarkStart w:id="74" w:name="_Ref239600011"/>
       <w:r>
         <w:rPr>
           <w:lang w:val="sr-RS"/>
@@ -7964,7 +7871,7 @@
         </w:rPr>
         <w:fldChar w:fldCharType="end"/>
       </w:r>
-      <w:bookmarkEnd w:id="73"/>
+      <w:bookmarkEnd w:id="74"/>
       <w:r>
         <w:rPr>
           <w:lang w:val="sr-RS"/>
@@ -8047,35 +7954,35 @@
         <w:rPr>
           <w:lang w:val="sr-RS"/>
         </w:rPr>
-        <w:t>Такође је уочена умерено јака позитивна корелација између занимљивости математике и оцене из математике (r ≈ 0.50), што указује да ученици који математику доживљавају као занимљиву често постижу и боље резултате у том предмету. Сличан образац примећен је и код физике, где постоји позитивна повезаност између занимљивости предмета и успеха ученика.</w:t>
-      </w:r>
-    </w:p>
-    <w:p>
-      <w:pPr>
-        <w:pStyle w:val="Style8"/>
-        <w:rPr>
-          <w:lang w:val="sr-RS"/>
-        </w:rPr>
-      </w:pPr>
-      <w:r>
-        <w:rPr>
-          <w:lang w:val="sr-RS"/>
-        </w:rPr>
-        <w:t>Посебно значајан резултат односи се на повезаност СТЕМ опредељења са интересовањем за СТЕМ предмете. Уочена је позитивна корелација између СТЕМ припадности и занимљивости математике (r ≈ 0.34), као и занимљивости физике (r ≈ 0.32). Ово указује да су ученици који припадају СТЕМ групи у просеку пријављивали веће интересовање за математику и физику током основног образовања.Ово указује да ученици који су касније уписали СТЕМ смерове у већој мери показују интересовање за ове предмете још током основног образовања.</w:t>
-      </w:r>
-    </w:p>
-    <w:p>
-      <w:pPr>
-        <w:pStyle w:val="Style8"/>
-        <w:rPr>
-          <w:lang w:val="sr-RS"/>
-        </w:rPr>
-      </w:pPr>
-      <w:r>
-        <w:rPr>
-          <w:lang w:val="sr-RS"/>
-        </w:rPr>
-        <w:t>Са друге стране, уочене су негативне корелације између перцепције тежине предмета и успеха ученика. На пример, тежина математике има умерено негативну корелацију са оценом из математике (r ≈ -0.50), што указује да ученици који математику доживљавају као тежу најчешће имају ниже оцене из тог предмета. Сличан тренд присутан је и код физике (r ≈ -0.39).</w:t>
+        <w:t>Такође је уочена умерено јака позитивна корелација између занимљивости математике и оцене из математике (r ≈ 0.48), што указује да ученици који математику доживљавају као занимљиву често постижу и боље резултате у том предмету. Сличан образац примећен је и код физике, где постоји позитивна повезаност између занимљивости предмета и успеха ученика.</w:t>
+      </w:r>
+    </w:p>
+    <w:p>
+      <w:pPr>
+        <w:pStyle w:val="Style8"/>
+        <w:rPr>
+          <w:lang w:val="sr-RS"/>
+        </w:rPr>
+      </w:pPr>
+      <w:r>
+        <w:rPr>
+          <w:lang w:val="sr-RS"/>
+        </w:rPr>
+        <w:t>Посебно значајан резултат односи се на повезаност СТЕМ опредељења са интересовањем за СТЕМ предмете. Уочена је позитивна корелација између СТЕМ припадности и занимљивости математике (r ≈ 0.35), као и занимљивости физике (r ≈ 0.31). Ово указује да су ученици који припадају СТЕМ групи у просеку пријављивали веће интересовање за математику и физику током основног образовања.</w:t>
+      </w:r>
+    </w:p>
+    <w:p>
+      <w:pPr>
+        <w:pStyle w:val="Style8"/>
+        <w:rPr>
+          <w:lang w:val="sr-RS"/>
+        </w:rPr>
+      </w:pPr>
+      <w:r>
+        <w:rPr>
+          <w:lang w:val="sr-RS"/>
+        </w:rPr>
+        <w:t>Са друге стране, уочене су негативне корелације између перцепције тежине предмета и успеха ученика. На пример, тежина математике има умерено негативну корелацију са оценом из математике (r ≈ -0.52), што указује да ученици који математику доживљавају као тежу најчешће имају ниже оцене из тог предмета. Сличан тренд присутан је и код физике (r ≈ -0.41).</w:t>
       </w:r>
     </w:p>
     <w:p>
@@ -8118,16 +8025,16 @@
           <w:lang w:val="sr-RS"/>
         </w:rPr>
       </w:pPr>
-      <w:bookmarkStart w:id="74" w:name="__RefHeading___Toc2333_1317292878"/>
-      <w:bookmarkStart w:id="75" w:name="_Toc225785092"/>
-      <w:bookmarkEnd w:id="74"/>
+      <w:bookmarkStart w:id="75" w:name="__RefHeading___Toc2333_1317292878"/>
+      <w:bookmarkStart w:id="76" w:name="_Toc225785092"/>
+      <w:bookmarkEnd w:id="75"/>
       <w:r>
         <w:rPr>
           <w:lang w:val="sr-RS"/>
         </w:rPr>
         <w:t>Статистички тестови повезаности са циљном променљивом</w:t>
       </w:r>
-      <w:bookmarkEnd w:id="75"/>
+      <w:bookmarkEnd w:id="76"/>
     </w:p>
     <w:p>
       <w:pPr>
@@ -8449,7 +8356,7 @@
           <w:lang w:val="sr-RS"/>
         </w:rPr>
       </w:pPr>
-      <w:bookmarkStart w:id="76" w:name="_Ref239600012"/>
+      <w:bookmarkStart w:id="77" w:name="_Ref239600012"/>
       <w:r>
         <w:rPr>
           <w:lang w:val="sr-RS"/>
@@ -8486,7 +8393,7 @@
         </w:rPr>
         <w:fldChar w:fldCharType="end"/>
       </w:r>
-      <w:bookmarkEnd w:id="76"/>
+      <w:bookmarkEnd w:id="77"/>
       <w:r>
         <w:rPr>
           <w:lang w:val="sr-RS"/>
@@ -8687,7 +8594,7 @@
         <w:rPr>
           <w:lang w:val="sr-RS"/>
         </w:rPr>
-        <w:t> женских, уз укупне бројеве по ћелијама из табеле), што у тексту рада треба навести уз бројеве из конкретног исписа анализе (</w:t>
+        <w:t> женских, уз укупне бројеве по ћелијама из табеле) (</w:t>
       </w:r>
       <w:r>
         <w:rPr>
@@ -8786,7 +8693,7 @@
           <w:lang w:val="sr-RS"/>
         </w:rPr>
       </w:pPr>
-      <w:bookmarkStart w:id="77" w:name="_Ref239600013"/>
+      <w:bookmarkStart w:id="78" w:name="_Ref239600013"/>
       <w:r>
         <w:rPr>
           <w:lang w:val="sr-RS"/>
@@ -8823,7 +8730,7 @@
         </w:rPr>
         <w:fldChar w:fldCharType="end"/>
       </w:r>
-      <w:bookmarkEnd w:id="77"/>
+      <w:bookmarkEnd w:id="78"/>
       <w:r>
         <w:rPr>
           <w:lang w:val="sr-RS"/>
@@ -8861,16 +8768,16 @@
           <w:lang w:val="sr-RS"/>
         </w:rPr>
       </w:pPr>
-      <w:bookmarkStart w:id="78" w:name="__RefHeading___Toc2335_1317292878"/>
-      <w:bookmarkStart w:id="79" w:name="_Toc225785093"/>
-      <w:bookmarkEnd w:id="78"/>
+      <w:bookmarkStart w:id="79" w:name="__RefHeading___Toc2335_1317292878"/>
+      <w:bookmarkStart w:id="80" w:name="_Toc225785093"/>
+      <w:bookmarkEnd w:id="79"/>
       <w:r>
         <w:rPr>
           <w:lang w:val="sr-RS"/>
         </w:rPr>
         <w:t>Припрема података</w:t>
       </w:r>
-      <w:bookmarkEnd w:id="79"/>
+      <w:bookmarkEnd w:id="80"/>
     </w:p>
     <w:p>
       <w:pPr>
@@ -8898,16 +8805,16 @@
           <w:lang w:val="sr-RS"/>
         </w:rPr>
       </w:pPr>
-      <w:bookmarkStart w:id="80" w:name="__RefHeading___Toc2337_1317292878"/>
-      <w:bookmarkStart w:id="81" w:name="_Toc225785094"/>
-      <w:bookmarkEnd w:id="80"/>
+      <w:bookmarkStart w:id="81" w:name="__RefHeading___Toc2337_1317292878"/>
+      <w:bookmarkStart w:id="82" w:name="_Toc225785094"/>
+      <w:bookmarkEnd w:id="81"/>
       <w:r>
         <w:rPr>
           <w:lang w:val="sr-RS"/>
         </w:rPr>
         <w:t>Уклањање непотребних колона</w:t>
       </w:r>
-      <w:bookmarkEnd w:id="81"/>
+      <w:bookmarkEnd w:id="82"/>
     </w:p>
     <w:p>
       <w:pPr>
@@ -8991,16 +8898,16 @@
           <w:lang w:val="sr-RS"/>
         </w:rPr>
       </w:pPr>
-      <w:bookmarkStart w:id="82" w:name="__RefHeading___Toc2339_1317292878"/>
-      <w:bookmarkStart w:id="83" w:name="_Toc225785095"/>
-      <w:bookmarkEnd w:id="82"/>
+      <w:bookmarkStart w:id="83" w:name="__RefHeading___Toc2339_1317292878"/>
+      <w:bookmarkStart w:id="84" w:name="_Toc225785095"/>
+      <w:bookmarkEnd w:id="83"/>
       <w:r>
         <w:rPr>
           <w:lang w:val="sr-RS"/>
         </w:rPr>
         <w:t>Обрада недостајућих вредности</w:t>
       </w:r>
-      <w:bookmarkEnd w:id="83"/>
+      <w:bookmarkEnd w:id="84"/>
     </w:p>
     <w:p>
       <w:pPr>
@@ -9042,16 +8949,16 @@
           <w:lang w:val="sr-RS"/>
         </w:rPr>
       </w:pPr>
-      <w:bookmarkStart w:id="84" w:name="__RefHeading___Toc2341_1317292878"/>
-      <w:bookmarkStart w:id="85" w:name="_Toc225785096"/>
-      <w:bookmarkEnd w:id="84"/>
+      <w:bookmarkStart w:id="85" w:name="__RefHeading___Toc2341_1317292878"/>
+      <w:bookmarkStart w:id="86" w:name="_Toc225785096"/>
+      <w:bookmarkEnd w:id="85"/>
       <w:r>
         <w:rPr>
           <w:lang w:val="sr-RS"/>
         </w:rPr>
         <w:t>Детекција дупликата</w:t>
       </w:r>
-      <w:bookmarkEnd w:id="85"/>
+      <w:bookmarkEnd w:id="86"/>
     </w:p>
     <w:p>
       <w:pPr>
@@ -9107,16 +9014,16 @@
           <w:lang w:val="sr-RS"/>
         </w:rPr>
       </w:pPr>
-      <w:bookmarkStart w:id="86" w:name="__RefHeading___Toc2343_1317292878"/>
-      <w:bookmarkStart w:id="87" w:name="_Toc225785097"/>
-      <w:bookmarkEnd w:id="86"/>
+      <w:bookmarkStart w:id="87" w:name="__RefHeading___Toc2343_1317292878"/>
+      <w:bookmarkStart w:id="88" w:name="_Toc225785097"/>
+      <w:bookmarkEnd w:id="87"/>
       <w:r>
         <w:rPr>
           <w:lang w:val="sr-RS"/>
         </w:rPr>
         <w:t>Детекција аномалија</w:t>
       </w:r>
-      <w:bookmarkEnd w:id="87"/>
+      <w:bookmarkEnd w:id="88"/>
     </w:p>
     <w:p>
       <w:pPr>
@@ -9186,16 +9093,16 @@
           <w:lang w:val="sr-RS"/>
         </w:rPr>
       </w:pPr>
-      <w:bookmarkStart w:id="88" w:name="__RefHeading___Toc2345_1317292878"/>
-      <w:bookmarkStart w:id="89" w:name="_Toc225785098"/>
-      <w:bookmarkEnd w:id="88"/>
+      <w:bookmarkStart w:id="89" w:name="__RefHeading___Toc2345_1317292878"/>
+      <w:bookmarkStart w:id="90" w:name="_Toc225785098"/>
+      <w:bookmarkEnd w:id="89"/>
       <w:r>
         <w:rPr>
           <w:lang w:val="sr-RS"/>
         </w:rPr>
         <w:t>Енкодирање категоријских променљивих</w:t>
       </w:r>
-      <w:bookmarkEnd w:id="89"/>
+      <w:bookmarkEnd w:id="90"/>
     </w:p>
     <w:p>
       <w:pPr>
@@ -9237,16 +9144,16 @@
           <w:lang w:val="sr-RS"/>
         </w:rPr>
       </w:pPr>
-      <w:bookmarkStart w:id="90" w:name="__RefHeading___Toc2347_1317292878"/>
-      <w:bookmarkStart w:id="91" w:name="_Toc225785100"/>
-      <w:bookmarkEnd w:id="90"/>
+      <w:bookmarkStart w:id="91" w:name="__RefHeading___Toc2347_1317292878"/>
+      <w:bookmarkStart w:id="92" w:name="_Toc225785100"/>
+      <w:bookmarkEnd w:id="91"/>
       <w:r>
         <w:rPr>
           <w:lang w:val="sr-RS"/>
         </w:rPr>
         <w:t>Подела скупа података (Stratified train-test split)</w:t>
       </w:r>
-      <w:bookmarkEnd w:id="91"/>
+      <w:bookmarkEnd w:id="92"/>
     </w:p>
     <w:p>
       <w:pPr>
@@ -9288,16 +9195,16 @@
           <w:lang w:val="sr-RS"/>
         </w:rPr>
       </w:pPr>
-      <w:bookmarkStart w:id="92" w:name="__RefHeading___Toc2349_1317292878"/>
-      <w:bookmarkStart w:id="93" w:name="_Toc225785099"/>
-      <w:bookmarkEnd w:id="92"/>
+      <w:bookmarkStart w:id="93" w:name="__RefHeading___Toc2349_1317292878"/>
+      <w:bookmarkStart w:id="94" w:name="_Toc225785099"/>
+      <w:bookmarkEnd w:id="93"/>
       <w:r>
         <w:rPr>
           <w:lang w:val="sr-RS"/>
         </w:rPr>
         <w:t>Скалирање нумеричких обележја</w:t>
       </w:r>
-      <w:bookmarkEnd w:id="93"/>
+      <w:bookmarkEnd w:id="94"/>
     </w:p>
     <w:p>
       <w:pPr>
@@ -9339,16 +9246,16 @@
           <w:lang w:val="sr-RS"/>
         </w:rPr>
       </w:pPr>
-      <w:bookmarkStart w:id="94" w:name="__RefHeading___Toc2351_1317292878"/>
-      <w:bookmarkStart w:id="95" w:name="_Toc225785101"/>
-      <w:bookmarkEnd w:id="94"/>
+      <w:bookmarkStart w:id="95" w:name="__RefHeading___Toc2351_1317292878"/>
+      <w:bookmarkStart w:id="96" w:name="_Toc225785101"/>
+      <w:bookmarkEnd w:id="95"/>
       <w:r>
         <w:rPr>
           <w:lang w:val="sr-RS"/>
         </w:rPr>
         <w:t>Селекција обележја</w:t>
       </w:r>
-      <w:bookmarkEnd w:id="95"/>
+      <w:bookmarkEnd w:id="96"/>
     </w:p>
     <w:p>
       <w:pPr>
@@ -9473,7 +9380,7 @@
           <w:lang w:val="sr-RS"/>
         </w:rPr>
       </w:pPr>
-      <w:bookmarkStart w:id="96" w:name="_RefSl15"/>
+      <w:bookmarkStart w:id="97" w:name="_RefSl15"/>
       <w:r>
         <w:rPr>
           <w:lang w:val="sr-RS"/>
@@ -9510,7 +9417,7 @@
         </w:rPr>
         <w:fldChar w:fldCharType="end"/>
       </w:r>
-      <w:bookmarkEnd w:id="96"/>
+      <w:bookmarkEnd w:id="97"/>
       <w:r>
         <w:rPr>
           <w:lang w:val="sr-RS"/>
@@ -9548,16 +9455,16 @@
           <w:lang w:val="sr-RS"/>
         </w:rPr>
       </w:pPr>
-      <w:bookmarkStart w:id="97" w:name="__RefHeading___Toc2353_1317292878"/>
-      <w:bookmarkStart w:id="98" w:name="_Toc225785102"/>
-      <w:bookmarkEnd w:id="97"/>
+      <w:bookmarkStart w:id="98" w:name="__RefHeading___Toc2353_1317292878"/>
+      <w:bookmarkStart w:id="99" w:name="_Toc225785102"/>
+      <w:bookmarkEnd w:id="98"/>
       <w:r>
         <w:rPr>
           <w:lang w:val="sr-RS"/>
         </w:rPr>
         <w:t>Методологија развоја и евалуације модела</w:t>
       </w:r>
-      <w:bookmarkEnd w:id="98"/>
+      <w:bookmarkEnd w:id="99"/>
     </w:p>
     <w:p>
       <w:pPr>
@@ -9585,16 +9492,16 @@
           <w:lang w:val="sr-RS"/>
         </w:rPr>
       </w:pPr>
-      <w:bookmarkStart w:id="99" w:name="__RefHeading___Toc2355_1317292878"/>
-      <w:bookmarkStart w:id="100" w:name="_Toc225785103"/>
-      <w:bookmarkEnd w:id="99"/>
+      <w:bookmarkStart w:id="100" w:name="__RefHeading___Toc2355_1317292878"/>
+      <w:bookmarkStart w:id="101" w:name="_Toc225785103"/>
+      <w:bookmarkEnd w:id="100"/>
       <w:r>
         <w:rPr>
           <w:lang w:val="sr-RS"/>
         </w:rPr>
         <w:t>Ток методологије анализе</w:t>
       </w:r>
-      <w:bookmarkEnd w:id="100"/>
+      <w:bookmarkEnd w:id="101"/>
     </w:p>
     <w:p>
       <w:pPr>
@@ -9719,7 +9626,7 @@
           <w:lang w:val="sr-RS"/>
         </w:rPr>
       </w:pPr>
-      <w:bookmarkStart w:id="101" w:name="_RefSl16"/>
+      <w:bookmarkStart w:id="102" w:name="_RefSl16"/>
       <w:r>
         <w:rPr>
           <w:lang w:val="sr-RS"/>
@@ -9756,7 +9663,7 @@
         </w:rPr>
         <w:fldChar w:fldCharType="end"/>
       </w:r>
-      <w:bookmarkEnd w:id="101"/>
+      <w:bookmarkEnd w:id="102"/>
       <w:r>
         <w:rPr>
           <w:lang w:val="sr-RS"/>
@@ -9776,16 +9683,16 @@
           <w:lang w:val="sr-RS"/>
         </w:rPr>
       </w:pPr>
-      <w:bookmarkStart w:id="102" w:name="__RefHeading___Toc2357_1317292878"/>
-      <w:bookmarkStart w:id="103" w:name="_Toc225785104"/>
-      <w:bookmarkEnd w:id="102"/>
+      <w:bookmarkStart w:id="103" w:name="__RefHeading___Toc2357_1317292878"/>
+      <w:bookmarkStart w:id="104" w:name="_Toc225785104"/>
+      <w:bookmarkEnd w:id="103"/>
       <w:r>
         <w:rPr>
           <w:lang w:val="sr-RS"/>
         </w:rPr>
         <w:t>Стратегија валидације</w:t>
       </w:r>
-      <w:bookmarkEnd w:id="103"/>
+      <w:bookmarkEnd w:id="104"/>
     </w:p>
     <w:p>
       <w:pPr>
@@ -9841,16 +9748,16 @@
           <w:lang w:val="sr-RS"/>
         </w:rPr>
       </w:pPr>
-      <w:bookmarkStart w:id="104" w:name="__RefHeading___Toc2359_1317292878"/>
-      <w:bookmarkStart w:id="105" w:name="_Toc225785107"/>
-      <w:bookmarkEnd w:id="104"/>
+      <w:bookmarkStart w:id="105" w:name="__RefHeading___Toc2359_1317292878"/>
+      <w:bookmarkStart w:id="106" w:name="_Toc225785107"/>
+      <w:bookmarkEnd w:id="105"/>
       <w:r>
         <w:rPr>
           <w:lang w:val="sr-RS"/>
         </w:rPr>
         <w:t>Метрике евалуације</w:t>
       </w:r>
-      <w:bookmarkEnd w:id="105"/>
+      <w:bookmarkEnd w:id="106"/>
     </w:p>
     <w:p>
       <w:pPr>
@@ -9878,16 +9785,16 @@
           <w:lang w:val="sr-RS"/>
         </w:rPr>
       </w:pPr>
-      <w:bookmarkStart w:id="106" w:name="__RefHeading___Toc2361_1317292878"/>
-      <w:bookmarkStart w:id="107" w:name="_Toc225785108"/>
-      <w:bookmarkEnd w:id="106"/>
+      <w:bookmarkStart w:id="107" w:name="__RefHeading___Toc2361_1317292878"/>
+      <w:bookmarkStart w:id="108" w:name="_Toc225785108"/>
+      <w:bookmarkEnd w:id="107"/>
       <w:r>
         <w:rPr>
           <w:lang w:val="sr-RS"/>
         </w:rPr>
         <w:t>Accuracy</w:t>
       </w:r>
-      <w:bookmarkEnd w:id="107"/>
+      <w:bookmarkEnd w:id="108"/>
     </w:p>
     <w:p>
       <w:pPr>
@@ -9915,16 +9822,16 @@
           <w:lang w:val="sr-RS"/>
         </w:rPr>
       </w:pPr>
-      <w:bookmarkStart w:id="108" w:name="__RefHeading___Toc2363_1317292878"/>
-      <w:bookmarkStart w:id="109" w:name="_Toc225785109"/>
-      <w:bookmarkEnd w:id="108"/>
+      <w:bookmarkStart w:id="109" w:name="__RefHeading___Toc2363_1317292878"/>
+      <w:bookmarkStart w:id="110" w:name="_Toc225785109"/>
+      <w:bookmarkEnd w:id="109"/>
       <w:r>
         <w:rPr>
           <w:lang w:val="sr-RS"/>
         </w:rPr>
         <w:t>Precision</w:t>
       </w:r>
-      <w:bookmarkEnd w:id="109"/>
+      <w:bookmarkEnd w:id="110"/>
     </w:p>
     <w:p>
       <w:pPr>
@@ -9952,16 +9859,16 @@
           <w:lang w:val="sr-RS"/>
         </w:rPr>
       </w:pPr>
-      <w:bookmarkStart w:id="110" w:name="__RefHeading___Toc2365_1317292878"/>
-      <w:bookmarkStart w:id="111" w:name="_Toc225785110"/>
-      <w:bookmarkEnd w:id="110"/>
+      <w:bookmarkStart w:id="111" w:name="__RefHeading___Toc2365_1317292878"/>
+      <w:bookmarkStart w:id="112" w:name="_Toc225785110"/>
+      <w:bookmarkEnd w:id="111"/>
       <w:r>
         <w:rPr>
           <w:lang w:val="sr-RS"/>
         </w:rPr>
         <w:t>Recall</w:t>
       </w:r>
-      <w:bookmarkEnd w:id="111"/>
+      <w:bookmarkEnd w:id="112"/>
     </w:p>
     <w:p>
       <w:pPr>
@@ -9989,16 +9896,16 @@
           <w:lang w:val="sr-RS"/>
         </w:rPr>
       </w:pPr>
-      <w:bookmarkStart w:id="112" w:name="__RefHeading___Toc2367_1317292878"/>
-      <w:bookmarkStart w:id="113" w:name="_Toc225785111"/>
-      <w:bookmarkEnd w:id="112"/>
+      <w:bookmarkStart w:id="113" w:name="__RefHeading___Toc2367_1317292878"/>
+      <w:bookmarkStart w:id="114" w:name="_Toc225785111"/>
+      <w:bookmarkEnd w:id="113"/>
       <w:r>
         <w:rPr>
           <w:lang w:val="sr-RS"/>
         </w:rPr>
         <w:t>F-1 Score (Macro и Weighted)</w:t>
       </w:r>
-      <w:bookmarkEnd w:id="113"/>
+      <w:bookmarkEnd w:id="114"/>
     </w:p>
     <w:p>
       <w:pPr>
@@ -10026,16 +9933,16 @@
           <w:lang w:val="sr-RS"/>
         </w:rPr>
       </w:pPr>
-      <w:bookmarkStart w:id="114" w:name="__RefHeading___Toc2369_1317292878"/>
-      <w:bookmarkStart w:id="115" w:name="_Toc225785112"/>
-      <w:bookmarkEnd w:id="114"/>
+      <w:bookmarkStart w:id="115" w:name="__RefHeading___Toc2369_1317292878"/>
+      <w:bookmarkStart w:id="116" w:name="_Toc225785112"/>
+      <w:bookmarkEnd w:id="115"/>
       <w:r>
         <w:rPr>
           <w:lang w:val="sr-RS"/>
         </w:rPr>
         <w:t>ROC-AUC</w:t>
       </w:r>
-      <w:bookmarkEnd w:id="115"/>
+      <w:bookmarkEnd w:id="116"/>
     </w:p>
     <w:p>
       <w:pPr>
@@ -10063,16 +9970,16 @@
           <w:lang w:val="sr-RS"/>
         </w:rPr>
       </w:pPr>
-      <w:bookmarkStart w:id="116" w:name="__RefHeading___Toc2371_1317292878"/>
-      <w:bookmarkStart w:id="117" w:name="_Toc225785113"/>
-      <w:bookmarkEnd w:id="116"/>
+      <w:bookmarkStart w:id="117" w:name="__RefHeading___Toc2371_1317292878"/>
+      <w:bookmarkStart w:id="118" w:name="_Toc225785113"/>
+      <w:bookmarkEnd w:id="117"/>
       <w:r>
         <w:rPr>
           <w:lang w:val="sr-RS"/>
         </w:rPr>
         <w:t>Confusion Matrix</w:t>
       </w:r>
-      <w:bookmarkEnd w:id="117"/>
+      <w:bookmarkEnd w:id="118"/>
     </w:p>
     <w:p>
       <w:pPr>
@@ -10183,7 +10090,7 @@
           <w:lang w:val="sr-RS"/>
         </w:rPr>
       </w:pPr>
-      <w:bookmarkStart w:id="118" w:name="_RefSl17"/>
+      <w:bookmarkStart w:id="119" w:name="_RefSl17"/>
       <w:r>
         <w:rPr>
           <w:lang w:val="sr-RS"/>
@@ -10220,7 +10127,7 @@
         </w:rPr>
         <w:fldChar w:fldCharType="end"/>
       </w:r>
-      <w:bookmarkEnd w:id="118"/>
+      <w:bookmarkEnd w:id="119"/>
       <w:r>
         <w:rPr>
           <w:lang w:val="sr-RS"/>
@@ -10240,16 +10147,16 @@
           <w:lang w:val="sr-RS"/>
         </w:rPr>
       </w:pPr>
-      <w:bookmarkStart w:id="119" w:name="__RefHeading___Toc2373_1317292878"/>
-      <w:bookmarkStart w:id="120" w:name="_Toc225785114"/>
-      <w:bookmarkEnd w:id="119"/>
+      <w:bookmarkStart w:id="120" w:name="__RefHeading___Toc2373_1317292878"/>
+      <w:bookmarkStart w:id="121" w:name="_Toc225785114"/>
+      <w:bookmarkEnd w:id="120"/>
       <w:r>
         <w:rPr>
           <w:lang w:val="sr-RS"/>
         </w:rPr>
         <w:t>Фино подешавање хиперпараметара</w:t>
       </w:r>
-      <w:bookmarkEnd w:id="120"/>
+      <w:bookmarkEnd w:id="121"/>
     </w:p>
     <w:p>
       <w:pPr>
@@ -10277,16 +10184,16 @@
           <w:lang w:val="sr-RS"/>
         </w:rPr>
       </w:pPr>
-      <w:bookmarkStart w:id="121" w:name="__RefHeading___Toc2375_1317292878"/>
-      <w:bookmarkStart w:id="122" w:name="_Toc225785115"/>
-      <w:bookmarkEnd w:id="121"/>
+      <w:bookmarkStart w:id="122" w:name="__RefHeading___Toc2375_1317292878"/>
+      <w:bookmarkStart w:id="123" w:name="_Toc225785115"/>
+      <w:bookmarkEnd w:id="122"/>
       <w:r>
         <w:rPr>
           <w:lang w:val="sr-RS"/>
         </w:rPr>
         <w:t>GridSearchCV</w:t>
       </w:r>
-      <w:bookmarkEnd w:id="122"/>
+      <w:bookmarkEnd w:id="123"/>
     </w:p>
     <w:p>
       <w:pPr>
@@ -10314,16 +10221,16 @@
           <w:lang w:val="sr-RS"/>
         </w:rPr>
       </w:pPr>
-      <w:bookmarkStart w:id="123" w:name="__RefHeading___Toc2377_1317292878"/>
-      <w:bookmarkStart w:id="124" w:name="_Toc225785116"/>
-      <w:bookmarkEnd w:id="123"/>
+      <w:bookmarkStart w:id="124" w:name="__RefHeading___Toc2377_1317292878"/>
+      <w:bookmarkStart w:id="125" w:name="_Toc225785116"/>
+      <w:bookmarkEnd w:id="124"/>
       <w:r>
         <w:rPr>
           <w:lang w:val="sr-RS"/>
         </w:rPr>
         <w:t>RandomizedSearchCV</w:t>
       </w:r>
-      <w:bookmarkEnd w:id="124"/>
+      <w:bookmarkEnd w:id="125"/>
     </w:p>
     <w:p>
       <w:pPr>
@@ -10351,16 +10258,16 @@
           <w:lang w:val="sr-RS"/>
         </w:rPr>
       </w:pPr>
-      <w:bookmarkStart w:id="125" w:name="__RefHeading___Toc2379_1317292878"/>
-      <w:bookmarkStart w:id="126" w:name="_Toc225785117"/>
-      <w:bookmarkEnd w:id="125"/>
+      <w:bookmarkStart w:id="126" w:name="__RefHeading___Toc2379_1317292878"/>
+      <w:bookmarkStart w:id="127" w:name="_Toc225785117"/>
+      <w:bookmarkEnd w:id="126"/>
       <w:r>
         <w:rPr>
           <w:lang w:val="sr-RS"/>
         </w:rPr>
         <w:t>Nested Cross-Validation</w:t>
       </w:r>
-      <w:bookmarkEnd w:id="126"/>
+      <w:bookmarkEnd w:id="127"/>
     </w:p>
     <w:p>
       <w:pPr>
@@ -10432,16 +10339,16 @@
           <w:lang w:val="sr-RS"/>
         </w:rPr>
       </w:pPr>
-      <w:bookmarkStart w:id="127" w:name="__RefHeading___Toc2381_1317292878"/>
-      <w:bookmarkStart w:id="128" w:name="_Toc225785118"/>
-      <w:bookmarkEnd w:id="127"/>
+      <w:bookmarkStart w:id="128" w:name="__RefHeading___Toc2381_1317292878"/>
+      <w:bookmarkStart w:id="129" w:name="_Toc225785118"/>
+      <w:bookmarkEnd w:id="128"/>
       <w:r>
         <w:rPr>
           <w:lang w:val="sr-RS"/>
         </w:rPr>
         <w:t>Резултати и компаративна анализа модела</w:t>
       </w:r>
-      <w:bookmarkEnd w:id="128"/>
+      <w:bookmarkEnd w:id="129"/>
     </w:p>
     <w:p>
       <w:pPr>
@@ -10469,16 +10376,16 @@
           <w:lang w:val="sr-RS"/>
         </w:rPr>
       </w:pPr>
-      <w:bookmarkStart w:id="129" w:name="__RefHeading___Toc2383_1317292878"/>
-      <w:bookmarkStart w:id="130" w:name="_Toc225785119"/>
-      <w:bookmarkEnd w:id="129"/>
+      <w:bookmarkStart w:id="130" w:name="__RefHeading___Toc2383_1317292878"/>
+      <w:bookmarkStart w:id="131" w:name="_Toc225785119"/>
+      <w:bookmarkEnd w:id="130"/>
       <w:r>
         <w:rPr>
           <w:lang w:val="sr-RS"/>
         </w:rPr>
         <w:t>Baseline модел (Dummy Classifier)</w:t>
       </w:r>
-      <w:bookmarkEnd w:id="130"/>
+      <w:bookmarkEnd w:id="131"/>
     </w:p>
     <w:p>
       <w:pPr>
@@ -10520,8 +10427,8 @@
           <w:lang w:val="sr-RS"/>
         </w:rPr>
       </w:pPr>
-      <w:bookmarkStart w:id="131" w:name="__RefHeading___Toc2016_4175910513"/>
-      <w:bookmarkEnd w:id="131"/>
+      <w:bookmarkStart w:id="132" w:name="__RefHeading___Toc2016_4175910513"/>
+      <w:bookmarkEnd w:id="132"/>
       <w:r>
         <w:rPr>
           <w:lang w:val="sr-RS"/>
@@ -10635,7 +10542,7 @@
         <w:rPr>
           <w:lang w:val="sr-RS"/>
         </w:rPr>
-        <w:t>XGBoost: 0,752 ± 0,021 (k = 90). Свих пет вредности налази се у уском распону 0,745–0,754 (разлика 0,009), унутар међусобних стандардних одступања — по унакрсној валидацији модели су практично неразликиви.</w:t>
+        <w:t>XGBoost: 0,752 ± 0,021 (k = 90). Свих пет вредности налази се у уском распону 0,745–0,754 (разлика 0,009), унутар међусобних стандардних одступања — модели остварују блиске просечне резултате унакрсне валидације.</w:t>
       </w:r>
     </w:p>
     <w:p>
@@ -10650,8 +10557,8 @@
           <w:lang w:val="sr-RS"/>
         </w:rPr>
       </w:pPr>
-      <w:bookmarkStart w:id="132" w:name="__RefHeading___Toc2018_4175910513"/>
-      <w:bookmarkEnd w:id="132"/>
+      <w:bookmarkStart w:id="133" w:name="__RefHeading___Toc2018_4175910513"/>
+      <w:bookmarkEnd w:id="133"/>
       <w:r>
         <w:rPr>
           <w:lang w:val="sr-RS"/>
@@ -10794,8 +10701,8 @@
           <w:lang w:val="sr-RS"/>
         </w:rPr>
       </w:pPr>
-      <w:bookmarkStart w:id="133" w:name="__RefHeading___Toc2020_4175910513"/>
-      <w:bookmarkEnd w:id="133"/>
+      <w:bookmarkStart w:id="134" w:name="__RefHeading___Toc2020_4175910513"/>
+      <w:bookmarkEnd w:id="134"/>
       <w:r>
         <w:rPr>
           <w:lang w:val="sr-RS"/>
@@ -10912,7 +10819,7 @@
           <w:lang w:val="sr-RS"/>
         </w:rPr>
       </w:pPr>
-      <w:bookmarkStart w:id="134" w:name="_RefSl18"/>
+      <w:bookmarkStart w:id="135" w:name="_RefSl18"/>
       <w:r>
         <w:rPr>
           <w:lang w:val="sr-RS"/>
@@ -10949,7 +10856,7 @@
         </w:rPr>
         <w:fldChar w:fldCharType="end"/>
       </w:r>
-      <w:bookmarkEnd w:id="134"/>
+      <w:bookmarkEnd w:id="135"/>
       <w:r>
         <w:rPr>
           <w:lang w:val="sr-RS"/>
@@ -10969,16 +10876,16 @@
           <w:lang w:val="sr-RS"/>
         </w:rPr>
       </w:pPr>
-      <w:bookmarkStart w:id="135" w:name="__RefHeading___Toc2389_1317292878"/>
-      <w:bookmarkStart w:id="136" w:name="_Toc225785122"/>
-      <w:bookmarkEnd w:id="135"/>
+      <w:bookmarkStart w:id="136" w:name="__RefHeading___Toc2389_1317292878"/>
+      <w:bookmarkStart w:id="137" w:name="_Toc225785122"/>
+      <w:bookmarkEnd w:id="136"/>
       <w:r>
         <w:rPr>
           <w:lang w:val="sr-RS"/>
         </w:rPr>
         <w:t>ROC криве</w:t>
       </w:r>
-      <w:bookmarkEnd w:id="136"/>
+      <w:bookmarkEnd w:id="137"/>
     </w:p>
     <w:p>
       <w:pPr>
@@ -11089,7 +10996,7 @@
           <w:lang w:val="sr-RS"/>
         </w:rPr>
       </w:pPr>
-      <w:bookmarkStart w:id="137" w:name="_RefSl19"/>
+      <w:bookmarkStart w:id="138" w:name="_RefSl19"/>
       <w:r>
         <w:rPr>
           <w:lang w:val="sr-RS"/>
@@ -11126,7 +11033,7 @@
         </w:rPr>
         <w:fldChar w:fldCharType="end"/>
       </w:r>
-      <w:bookmarkEnd w:id="137"/>
+      <w:bookmarkEnd w:id="138"/>
       <w:r>
         <w:rPr>
           <w:lang w:val="sr-RS"/>
@@ -11146,16 +11053,16 @@
           <w:lang w:val="sr-RS"/>
         </w:rPr>
       </w:pPr>
-      <w:bookmarkStart w:id="138" w:name="__RefHeading___Toc2391_1317292878"/>
-      <w:bookmarkStart w:id="139" w:name="_Toc225785123"/>
-      <w:bookmarkEnd w:id="138"/>
+      <w:bookmarkStart w:id="139" w:name="__RefHeading___Toc2391_1317292878"/>
+      <w:bookmarkStart w:id="140" w:name="_Toc225785123"/>
+      <w:bookmarkEnd w:id="139"/>
       <w:r>
         <w:rPr>
           <w:lang w:val="sr-RS"/>
         </w:rPr>
         <w:t>Дискусија перформанси</w:t>
       </w:r>
-      <w:bookmarkEnd w:id="139"/>
+      <w:bookmarkEnd w:id="140"/>
     </w:p>
     <w:p>
       <w:pPr>
@@ -11229,16 +11136,16 @@
           <w:lang w:val="sr-RS"/>
         </w:rPr>
       </w:pPr>
-      <w:bookmarkStart w:id="140" w:name="__RefHeading___Toc2393_1317292878"/>
-      <w:bookmarkStart w:id="141" w:name="_Toc225785124"/>
-      <w:bookmarkEnd w:id="140"/>
+      <w:bookmarkStart w:id="141" w:name="__RefHeading___Toc2393_1317292878"/>
+      <w:bookmarkStart w:id="142" w:name="_Toc225785124"/>
+      <w:bookmarkEnd w:id="141"/>
       <w:r>
         <w:rPr>
           <w:lang w:val="sr-RS"/>
         </w:rPr>
         <w:t>Интерпретабилност модела и анализа значаја обележја</w:t>
       </w:r>
-      <w:bookmarkEnd w:id="141"/>
+      <w:bookmarkEnd w:id="142"/>
     </w:p>
     <w:p>
       <w:pPr>
@@ -11266,16 +11173,16 @@
           <w:lang w:val="sr-RS"/>
         </w:rPr>
       </w:pPr>
-      <w:bookmarkStart w:id="142" w:name="__RefHeading___Toc2395_1317292878"/>
-      <w:bookmarkStart w:id="143" w:name="_Toc225785125"/>
-      <w:bookmarkEnd w:id="142"/>
+      <w:bookmarkStart w:id="143" w:name="__RefHeading___Toc2395_1317292878"/>
+      <w:bookmarkStart w:id="144" w:name="_Toc225785125"/>
+      <w:bookmarkEnd w:id="143"/>
       <w:r>
         <w:rPr>
           <w:lang w:val="sr-RS"/>
         </w:rPr>
         <w:t>Коефицијенти логистичке регресије (Odds Ratio интерпретација)</w:t>
       </w:r>
-      <w:bookmarkEnd w:id="143"/>
+      <w:bookmarkEnd w:id="144"/>
     </w:p>
     <w:p>
       <w:pPr>
@@ -11428,7 +11335,7 @@
           <w:lang w:val="sr-RS"/>
         </w:rPr>
       </w:pPr>
-      <w:bookmarkStart w:id="144" w:name="_RefSl20"/>
+      <w:bookmarkStart w:id="145" w:name="_RefSl20"/>
       <w:r>
         <w:rPr>
           <w:lang w:val="sr-RS"/>
@@ -11465,7 +11372,7 @@
         </w:rPr>
         <w:fldChar w:fldCharType="end"/>
       </w:r>
-      <w:bookmarkEnd w:id="144"/>
+      <w:bookmarkEnd w:id="145"/>
       <w:r>
         <w:rPr>
           <w:lang w:val="sr-RS"/>
@@ -11485,16 +11392,16 @@
           <w:lang w:val="sr-RS"/>
         </w:rPr>
       </w:pPr>
-      <w:bookmarkStart w:id="145" w:name="__RefHeading___Toc2397_1317292878"/>
-      <w:bookmarkStart w:id="146" w:name="_Toc225785126"/>
-      <w:bookmarkEnd w:id="145"/>
+      <w:bookmarkStart w:id="146" w:name="__RefHeading___Toc2397_1317292878"/>
+      <w:bookmarkStart w:id="147" w:name="_Toc225785126"/>
+      <w:bookmarkEnd w:id="146"/>
       <w:r>
         <w:rPr>
           <w:lang w:val="sr-RS"/>
         </w:rPr>
         <w:t>Feature importance (Random Forest, XGBoost)</w:t>
       </w:r>
-      <w:bookmarkEnd w:id="146"/>
+      <w:bookmarkEnd w:id="147"/>
     </w:p>
     <w:p>
       <w:pPr>
@@ -11633,7 +11540,7 @@
           <w:lang w:val="sr-RS"/>
         </w:rPr>
       </w:pPr>
-      <w:bookmarkStart w:id="147" w:name="_RefSl21"/>
+      <w:bookmarkStart w:id="148" w:name="_RefSl21"/>
       <w:r>
         <w:rPr>
           <w:lang w:val="sr-RS"/>
@@ -11670,7 +11577,7 @@
         </w:rPr>
         <w:fldChar w:fldCharType="end"/>
       </w:r>
-      <w:bookmarkEnd w:id="147"/>
+      <w:bookmarkEnd w:id="148"/>
       <w:r>
         <w:rPr>
           <w:lang w:val="sr-RS"/>
@@ -11690,16 +11597,16 @@
           <w:lang w:val="sr-RS"/>
         </w:rPr>
       </w:pPr>
-      <w:bookmarkStart w:id="148" w:name="__RefHeading___Toc2399_1317292878"/>
-      <w:bookmarkStart w:id="149" w:name="_Toc225785127"/>
-      <w:bookmarkEnd w:id="148"/>
+      <w:bookmarkStart w:id="149" w:name="__RefHeading___Toc2399_1317292878"/>
+      <w:bookmarkStart w:id="150" w:name="_Toc225785127"/>
+      <w:bookmarkEnd w:id="149"/>
       <w:r>
         <w:rPr>
           <w:lang w:val="sr-RS"/>
         </w:rPr>
         <w:t>SHAP анализа</w:t>
       </w:r>
-      <w:bookmarkEnd w:id="149"/>
+      <w:bookmarkEnd w:id="150"/>
     </w:p>
     <w:p>
       <w:pPr>
@@ -11824,7 +11731,7 @@
           <w:lang w:val="sr-RS"/>
         </w:rPr>
       </w:pPr>
-      <w:bookmarkStart w:id="150" w:name="_RefSl22"/>
+      <w:bookmarkStart w:id="151" w:name="_RefSl22"/>
       <w:r>
         <w:rPr>
           <w:lang w:val="sr-RS"/>
@@ -11861,7 +11768,7 @@
         </w:rPr>
         <w:fldChar w:fldCharType="end"/>
       </w:r>
-      <w:bookmarkEnd w:id="150"/>
+      <w:bookmarkEnd w:id="151"/>
       <w:r>
         <w:rPr>
           <w:lang w:val="sr-RS"/>
@@ -11881,10 +11788,10 @@
           <w:lang w:val="sr-RS"/>
         </w:rPr>
       </w:pPr>
-      <w:bookmarkStart w:id="151" w:name="__RefHeading___Toc2401_1317292878"/>
-      <w:bookmarkStart w:id="152" w:name="_Toc225785128"/>
-      <w:bookmarkEnd w:id="151"/>
+      <w:bookmarkStart w:id="152" w:name="__RefHeading___Toc2401_1317292878"/>
+      <w:bookmarkStart w:id="153" w:name="_Toc225785128"/>
       <w:bookmarkEnd w:id="152"/>
+      <w:bookmarkEnd w:id="153"/>
       <w:r>
         <w:rPr>
           <w:lang w:val="sr-RS"/>
@@ -12015,7 +11922,7 @@
           <w:lang w:val="sr-RS"/>
         </w:rPr>
       </w:pPr>
-      <w:bookmarkStart w:id="153" w:name="_RefSl23"/>
+      <w:bookmarkStart w:id="154" w:name="_RefSl23"/>
       <w:r>
         <w:rPr>
           <w:lang w:val="sr-RS"/>
@@ -12052,7 +11959,7 @@
         </w:rPr>
         <w:fldChar w:fldCharType="end"/>
       </w:r>
-      <w:bookmarkEnd w:id="153"/>
+      <w:bookmarkEnd w:id="154"/>
       <w:r>
         <w:rPr>
           <w:lang w:val="sr-RS"/>
@@ -12072,16 +11979,16 @@
           <w:lang w:val="sr-RS"/>
         </w:rPr>
       </w:pPr>
-      <w:bookmarkStart w:id="154" w:name="__RefHeading___Toc2403_1317292878"/>
-      <w:bookmarkStart w:id="155" w:name="_Toc225785129"/>
-      <w:bookmarkEnd w:id="154"/>
+      <w:bookmarkStart w:id="155" w:name="__RefHeading___Toc2403_1317292878"/>
+      <w:bookmarkStart w:id="156" w:name="_Toc225785129"/>
+      <w:bookmarkEnd w:id="155"/>
       <w:r>
         <w:rPr>
           <w:lang w:val="sr-RS"/>
         </w:rPr>
         <w:t>Анализа правичности и робусности модела</w:t>
       </w:r>
-      <w:bookmarkEnd w:id="155"/>
+      <w:bookmarkEnd w:id="156"/>
     </w:p>
     <w:p>
       <w:pPr>
@@ -12109,16 +12016,16 @@
           <w:lang w:val="sr-RS"/>
         </w:rPr>
       </w:pPr>
-      <w:bookmarkStart w:id="156" w:name="__RefHeading___Toc2405_1317292878"/>
-      <w:bookmarkStart w:id="157" w:name="_Toc225785130"/>
-      <w:bookmarkEnd w:id="156"/>
+      <w:bookmarkStart w:id="157" w:name="__RefHeading___Toc2405_1317292878"/>
+      <w:bookmarkStart w:id="158" w:name="_Toc225785130"/>
+      <w:bookmarkEnd w:id="157"/>
       <w:r>
         <w:rPr>
           <w:lang w:val="sr-RS"/>
         </w:rPr>
         <w:t>Перформансе модела по полу</w:t>
       </w:r>
-      <w:bookmarkEnd w:id="157"/>
+      <w:bookmarkEnd w:id="158"/>
     </w:p>
     <w:p>
       <w:pPr>
@@ -12145,7 +12052,17 @@
         <w:rPr>
           <w:lang w:val="sr-RS"/>
         </w:rPr>
-        <w:t>Гола тачност по полу је обмањујућа: женска подгрупа има већу базну стопу (тривијални модел који свима предвиђа НЕ-СТЕМ погодио би 67,1% девојчица наспрам 60,9% дечака), па виша тачност за девојчице не значи нужно да је модел бољи за њих. Зато се тачност пореди са базном стопом сваке подгрупе (тачност изнад базне,</w:t>
+        <w:t>Поређење тачности по полу без узимања у обзир различитих удела класа може довести до погрешног тумачења резултата: женска подгрупа има већу базну стопу (</w:t>
+      </w:r>
+      <w:r>
+        <w:rPr/>
+        <w:t>тривијални модел који предвиђа већинску класу сваке подгрупе погодио би 67,1% ученица предвиђањем НЕ-СТЕМ класе, а 60,9% ученика предвиђањем СТЕМ класе</w:t>
+      </w:r>
+      <w:r>
+        <w:rPr>
+          <w:lang w:val="sr-RS"/>
+        </w:rPr>
+        <w:t xml:space="preserve">), па виша тачност за ученице не значи нужно да је модел бољи за њих. Зато се тачност пореди са базном стопом сваке подгрупе (тачност изнад базне, </w:t>
       </w:r>
       <w:r>
         <w:rPr>
@@ -12257,7 +12174,7 @@
           <w:lang w:val="sr-RS"/>
         </w:rPr>
       </w:pPr>
-      <w:bookmarkStart w:id="158" w:name="_RefSl24"/>
+      <w:bookmarkStart w:id="159" w:name="_RefSl24"/>
       <w:r>
         <w:rPr>
           <w:lang w:val="sr-RS"/>
@@ -12294,7 +12211,7 @@
         </w:rPr>
         <w:fldChar w:fldCharType="end"/>
       </w:r>
-      <w:bookmarkEnd w:id="158"/>
+      <w:bookmarkEnd w:id="159"/>
       <w:r>
         <w:rPr>
           <w:lang w:val="sr-RS"/>
@@ -12314,16 +12231,16 @@
           <w:lang w:val="sr-RS"/>
         </w:rPr>
       </w:pPr>
-      <w:bookmarkStart w:id="159" w:name="__RefHeading___Toc2407_1317292878"/>
-      <w:bookmarkStart w:id="160" w:name="_Toc225785131"/>
-      <w:bookmarkEnd w:id="159"/>
+      <w:bookmarkStart w:id="160" w:name="__RefHeading___Toc2407_1317292878"/>
+      <w:bookmarkStart w:id="161" w:name="_Toc225785131"/>
+      <w:bookmarkEnd w:id="160"/>
       <w:r>
         <w:rPr>
           <w:lang w:val="sr-RS"/>
         </w:rPr>
         <w:t>Анализа потенцијалног bias-а</w:t>
       </w:r>
-      <w:bookmarkEnd w:id="160"/>
+      <w:bookmarkEnd w:id="161"/>
     </w:p>
     <w:p>
       <w:pPr>
@@ -12476,7 +12393,7 @@
           <w:lang w:val="sr-RS"/>
         </w:rPr>
       </w:pPr>
-      <w:bookmarkStart w:id="161" w:name="_RefSl25"/>
+      <w:bookmarkStart w:id="162" w:name="_RefSl25"/>
       <w:r>
         <w:rPr>
           <w:lang w:val="sr-RS"/>
@@ -12513,7 +12430,7 @@
         </w:rPr>
         <w:fldChar w:fldCharType="end"/>
       </w:r>
-      <w:bookmarkEnd w:id="161"/>
+      <w:bookmarkEnd w:id="162"/>
       <w:r>
         <w:rPr>
           <w:lang w:val="sr-RS"/>
@@ -12533,16 +12450,16 @@
           <w:lang w:val="sr-RS"/>
         </w:rPr>
       </w:pPr>
-      <w:bookmarkStart w:id="162" w:name="__RefHeading___Toc2409_1317292878"/>
-      <w:bookmarkStart w:id="163" w:name="_Toc225785132"/>
-      <w:bookmarkEnd w:id="162"/>
+      <w:bookmarkStart w:id="163" w:name="__RefHeading___Toc2409_1317292878"/>
+      <w:bookmarkStart w:id="164" w:name="_Toc225785132"/>
+      <w:bookmarkEnd w:id="163"/>
       <w:r>
         <w:rPr>
           <w:lang w:val="sr-RS"/>
         </w:rPr>
         <w:t>Анализа робусности (уклањање кључних предиктора)</w:t>
       </w:r>
-      <w:bookmarkEnd w:id="163"/>
+      <w:bookmarkEnd w:id="164"/>
     </w:p>
     <w:p>
       <w:pPr>
@@ -12681,7 +12598,7 @@
           <w:lang w:val="sr-RS"/>
         </w:rPr>
       </w:pPr>
-      <w:bookmarkStart w:id="164" w:name="_RefSl26"/>
+      <w:bookmarkStart w:id="165" w:name="_RefSl26"/>
       <w:r>
         <w:rPr>
           <w:lang w:val="sr-RS"/>
@@ -12718,7 +12635,7 @@
         </w:rPr>
         <w:fldChar w:fldCharType="end"/>
       </w:r>
-      <w:bookmarkEnd w:id="164"/>
+      <w:bookmarkEnd w:id="165"/>
       <w:r>
         <w:rPr>
           <w:lang w:val="sr-RS"/>
@@ -12738,16 +12655,16 @@
           <w:lang w:val="sr-RS"/>
         </w:rPr>
       </w:pPr>
-      <w:bookmarkStart w:id="165" w:name="__RefHeading___Toc2411_1317292878"/>
-      <w:bookmarkStart w:id="166" w:name="_Toc225785133"/>
-      <w:bookmarkEnd w:id="165"/>
+      <w:bookmarkStart w:id="166" w:name="__RefHeading___Toc2411_1317292878"/>
+      <w:bookmarkStart w:id="167" w:name="_Toc225785133"/>
+      <w:bookmarkEnd w:id="166"/>
       <w:r>
         <w:rPr>
           <w:lang w:val="sr-RS"/>
         </w:rPr>
         <w:t>Дискусија резултата</w:t>
       </w:r>
-      <w:bookmarkEnd w:id="166"/>
+      <w:bookmarkEnd w:id="167"/>
     </w:p>
     <w:p>
       <w:pPr>
@@ -12775,16 +12692,16 @@
           <w:lang w:val="sr-RS"/>
         </w:rPr>
       </w:pPr>
-      <w:bookmarkStart w:id="167" w:name="__RefHeading___Toc2413_1317292878"/>
-      <w:bookmarkStart w:id="168" w:name="_Toc225785134"/>
-      <w:bookmarkEnd w:id="167"/>
+      <w:bookmarkStart w:id="168" w:name="__RefHeading___Toc2413_1317292878"/>
+      <w:bookmarkStart w:id="169" w:name="_Toc225785134"/>
+      <w:bookmarkEnd w:id="168"/>
       <w:r>
         <w:rPr>
           <w:lang w:val="sr-RS"/>
         </w:rPr>
         <w:t>Одговори на истраживачка питања</w:t>
       </w:r>
-      <w:bookmarkEnd w:id="168"/>
+      <w:bookmarkEnd w:id="169"/>
     </w:p>
     <w:p>
       <w:pPr>
@@ -13572,7 +13489,7 @@
                 <w:kern w:val="0"/>
                 <w:lang w:val="sr-RS" w:eastAsia="en-US" w:bidi="en-US"/>
               </w:rPr>
-              <w:t>Потврђена</w:t>
+              <w:t>Није директно тестирана</w:t>
             </w:r>
           </w:p>
         </w:tc>
@@ -13595,11 +13512,11 @@
             </w:pPr>
             <w:r>
               <w:rPr>
-                <w:rFonts w:eastAsia="ＭＳ 明朝" w:cs="Times New Roman"/>
+                <w:rFonts w:eastAsia="MS Mincho" w:cs="Times New Roman"/>
                 <w:kern w:val="0"/>
                 <w:lang w:val="sr-RS" w:eastAsia="en-US" w:bidi="en-US"/>
               </w:rPr>
-              <w:t>Уклањање најзначајнијег предиктора готово не мења перформансе; сигнал је расподељен кроз више обележја</w:t>
+              <w:t>Анализа робусности показује да уклањање најзначајнијег предиктора готово не мења перформансе. Међутим, није спроведено директно поређење модела са једним обележјем и модела са више обележја.</w:t>
             </w:r>
           </w:p>
         </w:tc>
@@ -13630,16 +13547,16 @@
           <w:lang w:val="sr-RS"/>
         </w:rPr>
       </w:pPr>
-      <w:bookmarkStart w:id="169" w:name="__RefHeading___Toc2415_1317292878"/>
-      <w:bookmarkStart w:id="170" w:name="_Toc225785135"/>
-      <w:bookmarkEnd w:id="169"/>
+      <w:bookmarkStart w:id="170" w:name="__RefHeading___Toc2415_1317292878"/>
+      <w:bookmarkStart w:id="171" w:name="_Toc225785135"/>
+      <w:bookmarkEnd w:id="170"/>
       <w:r>
         <w:rPr>
           <w:lang w:val="sr-RS"/>
         </w:rPr>
         <w:t>Главни допринос рада</w:t>
       </w:r>
-      <w:bookmarkEnd w:id="170"/>
+      <w:bookmarkEnd w:id="171"/>
     </w:p>
     <w:p>
       <w:pPr>
@@ -13667,16 +13584,16 @@
           <w:lang w:val="sr-RS"/>
         </w:rPr>
       </w:pPr>
-      <w:bookmarkStart w:id="171" w:name="__RefHeading___Toc2417_1317292878"/>
-      <w:bookmarkStart w:id="172" w:name="_Toc225785136"/>
-      <w:bookmarkEnd w:id="171"/>
+      <w:bookmarkStart w:id="172" w:name="__RefHeading___Toc2417_1317292878"/>
+      <w:bookmarkStart w:id="173" w:name="_Toc225785136"/>
+      <w:bookmarkEnd w:id="172"/>
       <w:r>
         <w:rPr>
           <w:lang w:val="sr-RS"/>
         </w:rPr>
         <w:t>Практичне импликације</w:t>
       </w:r>
-      <w:bookmarkEnd w:id="172"/>
+      <w:bookmarkEnd w:id="173"/>
     </w:p>
     <w:p>
       <w:pPr>
@@ -13718,29 +13635,29 @@
           <w:lang w:val="sr-RS"/>
         </w:rPr>
       </w:pPr>
-      <w:bookmarkStart w:id="173" w:name="__RefHeading___Toc2419_1317292878"/>
-      <w:bookmarkStart w:id="174" w:name="_Toc225785137"/>
-      <w:bookmarkEnd w:id="173"/>
+      <w:bookmarkStart w:id="174" w:name="__RefHeading___Toc2419_1317292878"/>
+      <w:bookmarkStart w:id="175" w:name="_Toc225785137"/>
+      <w:bookmarkEnd w:id="174"/>
       <w:r>
         <w:rPr>
           <w:lang w:val="sr-RS"/>
         </w:rPr>
         <w:t>Ограничења истраживања</w:t>
       </w:r>
-      <w:bookmarkEnd w:id="174"/>
-    </w:p>
-    <w:p>
-      <w:pPr>
-        <w:pStyle w:val="Style8"/>
-        <w:rPr>
-          <w:lang w:val="sr-RS"/>
-        </w:rPr>
-      </w:pPr>
-      <w:r>
-        <w:rPr>
-          <w:lang w:val="sr-RS"/>
-        </w:rPr>
-        <w:t>Поред ограничења скупа података наведених у одељку 3.6 (субјективност анкетних одговора, узорак ограничен на гимназије, бинарна дефиниција циљне променљиве), истраживање носи и додатна методолошка ограничења. Подаци су прикупљени у једном временском тренутку (пресечна студија), па не омогућавају праћење стварног развоја интересовања ученика нити стварног уписа на СТЕМ студије након завршетка средње школе — циљна променљива одражава изражено опредељење, а не потврђен исход. Анализа правичности (одељак 9.2) ограничена је малим бројем ученика из руралних средина (свега 17 у тест скупу), што налазе за ту подгрупу чини индикативним, али статистички непоузданим. Коначно, модели су развијени и евалуирани искључиво на овом једном скупу података из одређеног географског и образовног контекста, па њихова генерализација на друге земље, типове школа или временске периоде захтева додатну валидацију.</w:t>
+      <w:bookmarkEnd w:id="175"/>
+    </w:p>
+    <w:p>
+      <w:pPr>
+        <w:pStyle w:val="Style8"/>
+        <w:rPr>
+          <w:lang w:val="sr-RS"/>
+        </w:rPr>
+      </w:pPr>
+      <w:r>
+        <w:rPr>
+          <w:lang w:val="sr-RS"/>
+        </w:rPr>
+        <w:t>Поред ограничења скупа података наведених у одељку 3.6 (субјективност анкетних одговора, узорак ограничен на гимназије, бинарна дефиниција циљне променљиве), истраживање носи и додатна методолошка ограничења. Подаци су прикупљени у једном временском тренутку (пресечна студија), па не омогућавају праћење стварног развоја интересовања ученика нити стварног уписа на СТЕМ студије након завршетка средње школе — циљна променљива одражава припадност средњошколском смеру који ученик већ похађа, а не његову намеру или будући упис на СТЕМ студије. Анализа правичности (одељак 9.2) ограничена је малим бројем ученика из руралних средина (свега 17 у тест скупу), што налазе за ту подгрупу чини индикативним, али статистички непоузданим. Коначно, модели су развијени и евалуирани искључиво на овом једном скупу података из одређеног географског и образовног контекста, па њихова генерализација на друге земље, типове школа или временске периоде захтева додатну валидацију.</w:t>
       </w:r>
     </w:p>
     <w:p>
@@ -13755,29 +13672,29 @@
           <w:lang w:val="sr-RS"/>
         </w:rPr>
       </w:pPr>
-      <w:bookmarkStart w:id="175" w:name="__RefHeading___Toc2421_1317292878"/>
-      <w:bookmarkStart w:id="176" w:name="_Toc225785138"/>
-      <w:bookmarkEnd w:id="175"/>
+      <w:bookmarkStart w:id="176" w:name="__RefHeading___Toc2421_1317292878"/>
+      <w:bookmarkStart w:id="177" w:name="_Toc225785138"/>
+      <w:bookmarkEnd w:id="176"/>
       <w:r>
         <w:rPr>
           <w:lang w:val="sr-RS"/>
         </w:rPr>
         <w:t>Правци будућих истраживања</w:t>
       </w:r>
-      <w:bookmarkEnd w:id="176"/>
-    </w:p>
-    <w:p>
-      <w:pPr>
-        <w:pStyle w:val="Style8"/>
-        <w:rPr>
-          <w:lang w:val="sr-RS"/>
-        </w:rPr>
-      </w:pPr>
-      <w:r>
-        <w:rPr>
-          <w:lang w:val="sr-RS"/>
-        </w:rPr>
-        <w:t>Будућа истраживања могла би да прошире анализу на већи и разноврснији узорак, укључујући ученике стручних школа и ученике из различитих региона, чиме би се омогућила поузданија анализа правичности за мање заступљене подгрупе. Лонгитудинално праћење ученика — од изражене намере до стварног уписа и завршетка СТЕМ студија — омогућило би проверу да ли модел заснован на изнетом опредељењу заиста предвиђа стваран исход. Такође, текстуални одговори из анкете (одељак 3.6), овде изостављени, могли би се укључити применом техника обраде природног језика ради потенцијалног побољшања модела. Коначно, било би вредно поновити анализу на подацима из других земаља или образовних система како би се проверило да ли су идентификовани фактори специфични за посматрани узорак или представљају шири образац.</w:t>
+      <w:bookmarkEnd w:id="177"/>
+    </w:p>
+    <w:p>
+      <w:pPr>
+        <w:pStyle w:val="Style8"/>
+        <w:rPr>
+          <w:lang w:val="sr-RS"/>
+        </w:rPr>
+      </w:pPr>
+      <w:r>
+        <w:rPr>
+          <w:lang w:val="sr-RS"/>
+        </w:rPr>
+        <w:t>Будућа истраживања могла би да прошире анализу на већи и разноврснији узорак, укључујући ученике стручних школа и ученике из различитих региона, чиме би се омогућила поузданија анализа правичности за мање заступљене подгрупе. Лонгитудинално праћење ученика омогућило би испитивање повезаности садашњег средњошколског смера и анкетних показатеља са каснијим уписом и завршетком СТЕМ студија. Такође, текстуални одговори из анкете (одељак 3.6), овде изостављени, могли би се укључити применом техника обраде природног језика ради потенцијалног побољшања модела. Коначно, било би вредно поновити анализу на подацима из других земаља или образовних система како би се проверило да ли су идентификовани фактори специфични за посматрани узорак или представљају шири образац.</w:t>
       </w:r>
     </w:p>
     <w:p>
@@ -13810,16 +13727,16 @@
           <w:lang w:val="sr-RS"/>
         </w:rPr>
       </w:pPr>
-      <w:bookmarkStart w:id="177" w:name="__RefHeading___Toc2423_1317292878"/>
-      <w:bookmarkStart w:id="178" w:name="_Toc225785139"/>
-      <w:bookmarkEnd w:id="177"/>
+      <w:bookmarkStart w:id="178" w:name="__RefHeading___Toc2423_1317292878"/>
+      <w:bookmarkStart w:id="179" w:name="_Toc225785139"/>
+      <w:bookmarkEnd w:id="178"/>
       <w:r>
         <w:rPr>
           <w:lang w:val="sr-RS"/>
         </w:rPr>
         <w:t>Закључак</w:t>
       </w:r>
-      <w:bookmarkEnd w:id="178"/>
+      <w:bookmarkEnd w:id="179"/>
     </w:p>
     <w:p>
       <w:pPr>
@@ -13871,16 +13788,16 @@
           <w:lang w:val="sr-RS"/>
         </w:rPr>
       </w:pPr>
-      <w:bookmarkStart w:id="179" w:name="__RefHeading___Toc2425_1317292878"/>
-      <w:bookmarkStart w:id="180" w:name="_Toc225785140"/>
-      <w:bookmarkEnd w:id="179"/>
+      <w:bookmarkStart w:id="180" w:name="__RefHeading___Toc2425_1317292878"/>
+      <w:bookmarkStart w:id="181" w:name="_Toc225785140"/>
+      <w:bookmarkEnd w:id="180"/>
       <w:r>
         <w:rPr>
           <w:lang w:val="sr-RS"/>
         </w:rPr>
         <w:t>Литература</w:t>
       </w:r>
-      <w:bookmarkEnd w:id="180"/>
+      <w:bookmarkEnd w:id="181"/>
     </w:p>
     <w:p>
       <w:pPr>
@@ -13898,7 +13815,7 @@
         <w:rPr>
           <w:lang w:val="sr-RS"/>
         </w:rPr>
-        <w:t>Stašević, F., Milenković, A., Maksimović, A., Svičević, M., &amp; Krstić, L. (2025). Interest in STEM and its relations to the educational achievement and socio-demographic characteristics of grammar school students in Serbia. Journal of Baltic Science Education, 24(2), 360–376. https://doi.org/10.33225/jbse/25.24.360</w:t>
+        <w:t>Wang, M.-T., &amp; Degol, J. L. (2017). Gender gap in science, technology, engineering, and mathematics (STEM): Current knowledge, implications for practice, policy, and future directions. Educational Psychology Review, 29(1), 119–140. https://doi.org/10.1007/s10648-015-9355-x (Последњи приступ: септембар 2026)</w:t>
       </w:r>
     </w:p>
     <w:p>
@@ -13917,7 +13834,7 @@
         <w:rPr>
           <w:lang w:val="sr-RS"/>
         </w:rPr>
-        <w:t>Скуп података „СТЕМ“ (СТЕМ.xlsx) — анкетни подаци ученика гимназија прикупљени за потребе овог истраживања, доступни уз изворни код рада. Доступно на: https://github.com/tdjokovic/stem_factors</w:t>
+        <w:t>Maltese, A. V., &amp; Tai, R. H. (2011). Pipeline persistence: Examining the association of educational experiences with earned degrees in STEM among U.S. students. Science Education, 95(5), 877–907. https://doi.org/10.1002/sce.20441 (Последњи приступ: септембар 2026)</w:t>
       </w:r>
     </w:p>
     <w:p>
@@ -13936,29 +13853,7 @@
         <w:rPr>
           <w:lang w:val="sr-RS"/>
         </w:rPr>
-        <w:t>Документација библиотеке pandas (верзија 2.3.3). Доступно на: https://pandas.pydata.org/</w:t>
-      </w:r>
-      <w:commentRangeStart w:id="0"/>
-      <w:r>
-        <w:rPr>
-          <w:lang w:val="sr-RS"/>
-        </w:rPr>
-        <w:t>docs</w:t>
-      </w:r>
-      <w:r>
-        <w:rPr>
-          <w:lang w:val="sr-RS"/>
-        </w:rPr>
-      </w:r>
-      <w:commentRangeEnd w:id="0"/>
-      <w:r>
-        <w:commentReference w:id="0"/>
-      </w:r>
-      <w:r>
-        <w:rPr>
-          <w:lang w:val="sr-RS"/>
-        </w:rPr>
-        <w:t>/</w:t>
+        <w:t>Romero, C., &amp; Ventura, S. (2010). Educational data mining: A review of the state of the art. IEEE Transactions on Systems, Man, and Cybernetics, Part C (Applications and Reviews), 40(6), 601–618. https://doi.org/10.1109/TSMCC.2010.2053532 (Последњи приступ: септембар 2026)</w:t>
       </w:r>
     </w:p>
     <w:p>
@@ -13977,7 +13872,7 @@
         <w:rPr>
           <w:lang w:val="sr-RS"/>
         </w:rPr>
-        <w:t>Документација библиотеке NumPy (верзија 2.3.5). Доступно на: https://numpy.org/doc/stable/</w:t>
+        <w:t>Cox, D. R. (1958). The regression analysis of binary sequences. Journal of the Royal Statistical Society: Series B (Methodological), 20(2), 215–232. https://doi.org/10.1111/j.2517-6161.1958.tb00292.x (Последњи приступ: септембар 2026)</w:t>
       </w:r>
     </w:p>
     <w:p>
@@ -13996,7 +13891,7 @@
         <w:rPr>
           <w:lang w:val="sr-RS"/>
         </w:rPr>
-        <w:t>Документација библиотеке SciPy (верзија 1.16.3). Доступно на: https://docs.scipy.org/doc/scipy/</w:t>
+        <w:t>Cover, T., &amp; Hart, P. (1967). Nearest neighbor pattern classification. IEEE Transactions on Information Theory, 13(1), 21–27. https://doi.org/10.1109/TIT.1967.1053964 (Последњи приступ: септембар 2026)</w:t>
       </w:r>
     </w:p>
     <w:p>
@@ -14015,7 +13910,7 @@
         <w:rPr>
           <w:lang w:val="sr-RS"/>
         </w:rPr>
-        <w:t>Документација библиотеке Matplotlib (верзија 3.10.8). Доступно на: https://matplotlib.org/stable/</w:t>
+        <w:t>Cortes, C., &amp; Vapnik, V. (1995). Support-vector networks. Machine Learning, 20(3), 273–297. https://doi.org/10.1007/BF00994018 (Последњи приступ: септембар 2026)</w:t>
       </w:r>
     </w:p>
     <w:p>
@@ -14034,7 +13929,7 @@
         <w:rPr>
           <w:lang w:val="sr-RS"/>
         </w:rPr>
-        <w:t>Документација библиотеке seaborn (верзија 0.13.2). Доступно на: https://seaborn.pydata.org/</w:t>
+        <w:t>Breiman, L. (2001). Random forests. Machine Learning, 45(1), 5–32. https://doi.org/10.1023/A:1010933404324 (Последњи приступ: септембар 2026)</w:t>
       </w:r>
     </w:p>
     <w:p>
@@ -14053,7 +13948,7 @@
         <w:rPr>
           <w:lang w:val="sr-RS"/>
         </w:rPr>
-        <w:t>Документација библиотеке scikit-learn (верзија 1.8.0). Доступно на: https://scikit-learn.org/stable/</w:t>
+        <w:t>Chen, T., &amp; Guestrin, C. (2016). XGBoost: A scalable tree boosting system. In Proceedings of the 22nd ACM SIGKDD International Conference on Knowledge Discovery and Data Mining (pp. 785–794). https://doi.org/10.1145/2939672.2939785 (Последњи приступ: септембар 2026)</w:t>
       </w:r>
     </w:p>
     <w:p>
@@ -14072,7 +13967,7 @@
         <w:rPr>
           <w:lang w:val="sr-RS"/>
         </w:rPr>
-        <w:t>Документација библиотеке XGBoost (верзија 3.1.3). Доступно на: https://xgboost.readthedocs.io/en/stable/</w:t>
+        <w:t>Lundberg, S. M., &amp; Lee, S.-I. (2017). A unified approach to interpreting model predictions. In Advances in Neural Information Processing Systems 30 (NeurIPS 2017) (pp. 4768–4777). https://proceedings.neurips.cc/paper/2017/hash/8a20a8621978632d76c43dfd28b67767-Abstract.html (Последњи приступ: септембар 2026)</w:t>
       </w:r>
     </w:p>
     <w:p>
@@ -14091,7 +13986,7 @@
         <w:rPr>
           <w:lang w:val="sr-RS"/>
         </w:rPr>
-        <w:t>Документација библиотеке SHAP (верзија 0.52.0). Доступно на: https://shap.readthedocs.io/en/latest/</w:t>
+        <w:t>Barocas, S., Hardt, M., &amp; Narayanan, A. (2023). Fairness and Machine Learning: Limitations and Opportunities. MIT Press. Доступно на: https://fairmlbook.org/ (Последњи приступ: септембар 2026)</w:t>
       </w:r>
     </w:p>
     <w:p>
@@ -14110,7 +14005,197 @@
         <w:rPr>
           <w:lang w:val="sr-RS"/>
         </w:rPr>
-        <w:t>Документација програмског језика Python (верзија 3.14.2). Доступно на: https://docs.python.org/3/</w:t>
+        <w:t>Stašević, F., Milenković, A., Maksimović, A., Svičević, M., &amp; Krstić, L. (2025). Interest in STEM and its relations to the educational achievement and socio-demographic characteristics of grammar school students in Serbia. Journal of Baltic Science Education, 24(2), 360–376. https://doi.org/10.33225/jbse/25.24.360 (Последњи приступ: септембар 2026)</w:t>
+      </w:r>
+    </w:p>
+    <w:p>
+      <w:pPr>
+        <w:pStyle w:val="Reference"/>
+        <w:numPr>
+          <w:ilvl w:val="0"/>
+          <w:numId w:val="2"/>
+        </w:numPr>
+        <w:ind w:firstLine="567" w:left="360"/>
+        <w:rPr>
+          <w:lang w:val="sr-RS"/>
+        </w:rPr>
+      </w:pPr>
+      <w:r>
+        <w:rPr>
+          <w:lang w:val="sr-RS"/>
+        </w:rPr>
+        <w:t>Скуп података „СТЕМ“ (СТЕМ.xlsx) — анкетни подаци ученика гимназија прикупљени за потребе овог истраживања, доступни уз изворни код рада. Доступно на: https://github.com/tdjokovic/stem_factors (Последњи приступ: септембар 2026)</w:t>
+      </w:r>
+    </w:p>
+    <w:p>
+      <w:pPr>
+        <w:pStyle w:val="Reference"/>
+        <w:numPr>
+          <w:ilvl w:val="0"/>
+          <w:numId w:val="2"/>
+        </w:numPr>
+        <w:ind w:firstLine="567" w:left="360"/>
+        <w:rPr>
+          <w:lang w:val="sr-RS"/>
+        </w:rPr>
+      </w:pPr>
+      <w:r>
+        <w:rPr>
+          <w:lang w:val="sr-RS"/>
+        </w:rPr>
+        <w:t>Документација библиотеке pandas (верзија 2.3.3). Доступно на: https://pandas.pydata.org/docs/ (Последњи приступ: септембар 2026)</w:t>
+      </w:r>
+    </w:p>
+    <w:p>
+      <w:pPr>
+        <w:pStyle w:val="Reference"/>
+        <w:numPr>
+          <w:ilvl w:val="0"/>
+          <w:numId w:val="2"/>
+        </w:numPr>
+        <w:ind w:firstLine="567" w:left="360"/>
+        <w:rPr>
+          <w:lang w:val="sr-RS"/>
+        </w:rPr>
+      </w:pPr>
+      <w:r>
+        <w:rPr>
+          <w:lang w:val="sr-RS"/>
+        </w:rPr>
+        <w:t>Документација библиотеке NumPy (верзија 2.3.5). Доступно на: https://numpy.org/doc/stable/ (Последњи приступ: септембар 2026)</w:t>
+      </w:r>
+    </w:p>
+    <w:p>
+      <w:pPr>
+        <w:pStyle w:val="Reference"/>
+        <w:numPr>
+          <w:ilvl w:val="0"/>
+          <w:numId w:val="2"/>
+        </w:numPr>
+        <w:ind w:firstLine="567" w:left="360"/>
+        <w:rPr>
+          <w:lang w:val="sr-RS"/>
+        </w:rPr>
+      </w:pPr>
+      <w:r>
+        <w:rPr>
+          <w:lang w:val="sr-RS"/>
+        </w:rPr>
+        <w:t>Документација библиотеке SciPy (верзија 1.16.3). Доступно на: https://docs.scipy.org/doc/scipy/ (Последњи приступ: септембар 2026)</w:t>
+      </w:r>
+    </w:p>
+    <w:p>
+      <w:pPr>
+        <w:pStyle w:val="Reference"/>
+        <w:numPr>
+          <w:ilvl w:val="0"/>
+          <w:numId w:val="2"/>
+        </w:numPr>
+        <w:ind w:firstLine="567" w:left="360"/>
+        <w:rPr>
+          <w:lang w:val="sr-RS"/>
+        </w:rPr>
+      </w:pPr>
+      <w:r>
+        <w:rPr>
+          <w:lang w:val="sr-RS"/>
+        </w:rPr>
+        <w:t>Документација библиотеке Matplotlib (верзија 3.10.8). Доступно на: https://matplotlib.org/stable/ (Последњи приступ: септембар 2026)</w:t>
+      </w:r>
+    </w:p>
+    <w:p>
+      <w:pPr>
+        <w:pStyle w:val="Reference"/>
+        <w:numPr>
+          <w:ilvl w:val="0"/>
+          <w:numId w:val="2"/>
+        </w:numPr>
+        <w:ind w:firstLine="567" w:left="360"/>
+        <w:rPr>
+          <w:lang w:val="sr-RS"/>
+        </w:rPr>
+      </w:pPr>
+      <w:r>
+        <w:rPr>
+          <w:lang w:val="sr-RS"/>
+        </w:rPr>
+        <w:t>Документација библиотеке seaborn (верзија 0.13.2). Доступно на: https://seaborn.pydata.org/ (Последњи приступ: септембар 2026)</w:t>
+      </w:r>
+    </w:p>
+    <w:p>
+      <w:pPr>
+        <w:pStyle w:val="Reference"/>
+        <w:numPr>
+          <w:ilvl w:val="0"/>
+          <w:numId w:val="2"/>
+        </w:numPr>
+        <w:ind w:firstLine="567" w:left="360"/>
+        <w:rPr>
+          <w:lang w:val="sr-RS"/>
+        </w:rPr>
+      </w:pPr>
+      <w:r>
+        <w:rPr>
+          <w:lang w:val="sr-RS"/>
+        </w:rPr>
+        <w:t>Документација библиотеке scikit-learn (верзија 1.8.0). Доступно на: https://scikit-learn.org/stable/ (Последњи приступ: септембар 2026)</w:t>
+      </w:r>
+    </w:p>
+    <w:p>
+      <w:pPr>
+        <w:pStyle w:val="Reference"/>
+        <w:numPr>
+          <w:ilvl w:val="0"/>
+          <w:numId w:val="2"/>
+        </w:numPr>
+        <w:ind w:firstLine="567" w:left="360"/>
+        <w:rPr>
+          <w:lang w:val="sr-RS"/>
+        </w:rPr>
+      </w:pPr>
+      <w:r>
+        <w:rPr>
+          <w:lang w:val="sr-RS"/>
+        </w:rPr>
+        <w:t>Документација библиотеке XGBoost (верзија 3.1.3). Доступно на: https://xgboost.readthedocs.io/en/stable/ (Последњи приступ: септембар 2026)</w:t>
+      </w:r>
+    </w:p>
+    <w:p>
+      <w:pPr>
+        <w:pStyle w:val="Reference"/>
+        <w:numPr>
+          <w:ilvl w:val="0"/>
+          <w:numId w:val="2"/>
+        </w:numPr>
+        <w:ind w:firstLine="567" w:left="360"/>
+        <w:rPr>
+          <w:lang w:val="sr-RS"/>
+        </w:rPr>
+      </w:pPr>
+      <w:r>
+        <w:rPr>
+          <w:lang w:val="sr-RS"/>
+        </w:rPr>
+        <w:t>Документација библиотеке SHAP (верзија 0.52.0). Доступно на: https://shap.readthedocs.io/en/latest/ (Последњи приступ: септембар 2026)</w:t>
+      </w:r>
+    </w:p>
+    <w:p>
+      <w:pPr>
+        <w:pStyle w:val="Reference"/>
+        <w:numPr>
+          <w:ilvl w:val="0"/>
+          <w:numId w:val="2"/>
+        </w:numPr>
+        <w:ind w:firstLine="567" w:left="360"/>
+        <w:rPr>
+          <w:lang w:val="sr-RS"/>
+        </w:rPr>
+      </w:pPr>
+      <w:r>
+        <w:rPr>
+          <w:lang w:val="sr-RS"/>
+        </w:rPr>
+        <w:t>Документација програмског језика Python (верзија 3.14.2). Доступно на: https://docs.python.org/3/ (Последњи приступ: септембар 2026)</w:t>
       </w:r>
     </w:p>
     <w:p>
@@ -14121,16 +14206,16 @@
           <w:lang w:val="sr-RS"/>
         </w:rPr>
       </w:pPr>
-      <w:bookmarkStart w:id="181" w:name="__RefHeading___Toc2427_1317292878"/>
-      <w:bookmarkStart w:id="182" w:name="_Toc225785141"/>
-      <w:bookmarkEnd w:id="181"/>
+      <w:bookmarkStart w:id="182" w:name="__RefHeading___Toc2427_1317292878"/>
+      <w:bookmarkStart w:id="183" w:name="_Toc225785141"/>
+      <w:bookmarkEnd w:id="182"/>
       <w:r>
         <w:rPr>
           <w:lang w:val="sr-RS"/>
         </w:rPr>
         <w:t>Кратка биографија кандидата</w:t>
       </w:r>
-      <w:bookmarkEnd w:id="182"/>
+      <w:bookmarkEnd w:id="183"/>
     </w:p>
     <w:p>
       <w:pPr>
@@ -14385,7 +14470,7 @@
           <w:rFonts w:cs="Calibri"/>
           <w:b/>
           <w:bCs/>
-          <w:color w:val="FF0000"/>
+          <w:color w:val="000000"/>
           <w:lang w:val="sr-RS"/>
         </w:rPr>
       </w:pPr>
@@ -14394,7 +14479,7 @@
           <w:rFonts w:cs="Calibri"/>
           <w:b/>
           <w:bCs/>
-          <w:color w:val="FF0000"/>
+          <w:color w:val="000000"/>
           <w:lang w:val="sr-RS"/>
         </w:rPr>
       </w:r>
@@ -14691,114 +14776,6 @@
     </w:sectPr>
   </w:body>
 </w:document>
-</file>
-
-<file path=word/comments.xml><?xml version="1.0" encoding="utf-8"?>
-<w:comments xmlns:o="urn:schemas-microsoft-com:office:office" xmlns:r="http://schemas.openxmlformats.org/officeDocument/2006/relationships" xmlns:v="urn:schemas-microsoft-com:vml" xmlns:w="http://schemas.openxmlformats.org/wordprocessingml/2006/main" xmlns:w10="urn:schemas-microsoft-com:office:word" xmlns:wp="http://schemas.openxmlformats.org/drawingml/2006/wordprocessingDrawing" xmlns:pic="http://schemas.openxmlformats.org/drawingml/2006/picture" xmlns:wps="http://schemas.microsoft.com/office/word/2010/wordprocessingShape" xmlns:wpg="http://schemas.microsoft.com/office/word/2010/wordprocessingGroup" xmlns:mc="http://schemas.openxmlformats.org/markup-compatibility/2006" xmlns:wp14="http://schemas.microsoft.com/office/word/2010/wordprocessingDrawing" xmlns:w14="http://schemas.microsoft.com/office/word/2010/wordml" xmlns:w15="http://schemas.microsoft.com/office/word/2012/wordml" mc:Ignorable="w14 wp14 w15">
-  <w:comment w:id="0" w:author="Marina Svicevic" w:date="2026-09-09T13:21:00Z" w:initials="MS">
-    <w:p>
-      <w:pPr>
-        <w:overflowPunct w:val="true"/>
-        <w:rPr/>
-      </w:pPr>
-      <w:r>
-        <w:annotationRef/>
-      </w:r>
-      <w:r>
-        <w:rPr>
-          <w:rFonts w:asciiTheme="minorHAnsi" w:eastAsiaTheme="minorEastAsia" w:hAnsiTheme="minorHAnsi"/>
-          <w:sz w:val="22"/>
-          <w:szCs w:val="22"/>
-          <w:lang w:val="sr-RS"/>
-        </w:rPr>
-        <w:t>За све линкове додај последњи приступ:</w:t>
-      </w:r>
-    </w:p>
-    <w:p>
-      <w:pPr>
-        <w:overflowPunct w:val="true"/>
-        <w:rPr/>
-      </w:pPr>
-      <w:r>
-        <w:rPr>
-          <w:rFonts w:asciiTheme="minorHAnsi" w:eastAsiaTheme="minorEastAsia" w:hAnsiTheme="minorHAnsi"/>
-          <w:sz w:val="22"/>
-          <w:szCs w:val="22"/>
-          <w:lang w:val="ru-RU"/>
-        </w:rPr>
-        <w:t>О</w:t>
-      </w:r>
-      <w:r>
-        <w:rPr>
-          <w:rFonts w:asciiTheme="minorHAnsi" w:eastAsiaTheme="minorEastAsia" w:hAnsiTheme="minorHAnsi"/>
-          <w:sz w:val="22"/>
-          <w:szCs w:val="22"/>
-          <w:lang w:val="sr-RS"/>
-        </w:rPr>
-        <w:t>вако у загради</w:t>
-      </w:r>
-    </w:p>
-    <w:p>
-      <w:pPr>
-        <w:overflowPunct w:val="true"/>
-        <w:rPr/>
-      </w:pPr>
-      <w:r>
-        <w:rPr>
-          <w:rFonts w:asciiTheme="minorHAnsi" w:eastAsiaTheme="minorEastAsia" w:hAnsiTheme="minorHAnsi"/>
-          <w:sz w:val="22"/>
-          <w:szCs w:val="22"/>
-        </w:rPr>
-      </w:r>
-    </w:p>
-    <w:p>
-      <w:pPr>
-        <w:overflowPunct w:val="true"/>
-        <w:rPr/>
-      </w:pPr>
-      <w:r>
-        <w:rPr>
-          <w:rFonts w:asciiTheme="minorHAnsi" w:eastAsiaTheme="minorEastAsia" w:hAnsiTheme="minorHAnsi"/>
-          <w:color w:val="000000"/>
-          <w:sz w:val="22"/>
-          <w:szCs w:val="22"/>
-          <w:lang w:val="sr-RS"/>
-        </w:rPr>
-        <w:t>(</w:t>
-      </w:r>
-      <w:r>
-        <w:rPr>
-          <w:rFonts w:asciiTheme="minorHAnsi" w:eastAsiaTheme="minorEastAsia" w:hAnsiTheme="minorHAnsi"/>
-          <w:color w:val="000000"/>
-          <w:sz w:val="22"/>
-          <w:szCs w:val="22"/>
-          <w:lang w:val="ru-RU"/>
-        </w:rPr>
-        <w:t>Последњи приступ: септембар 202</w:t>
-      </w:r>
-      <w:r>
-        <w:rPr>
-          <w:rFonts w:asciiTheme="minorHAnsi" w:eastAsiaTheme="minorEastAsia" w:hAnsiTheme="minorHAnsi"/>
-          <w:color w:val="000000"/>
-          <w:sz w:val="22"/>
-          <w:szCs w:val="22"/>
-          <w:lang w:val="sr-RS"/>
-        </w:rPr>
-        <w:t>6</w:t>
-      </w:r>
-      <w:r>
-        <w:rPr>
-          <w:rFonts w:asciiTheme="minorHAnsi" w:eastAsiaTheme="minorEastAsia" w:hAnsiTheme="minorHAnsi"/>
-          <w:color w:val="000000"/>
-          <w:sz w:val="22"/>
-          <w:szCs w:val="22"/>
-          <w:lang w:val="ru-RU"/>
-        </w:rPr>
-        <w:t xml:space="preserve">) </w:t>
-      </w:r>
-    </w:p>
-  </w:comment>
-</w:comments>
 </file>
 
 <file path=word/footer1.xml><?xml version="1.0" encoding="utf-8"?>
@@ -14846,7 +14823,7 @@
         </w:r>
         <w:r>
           <w:rPr/>
-          <w:t>55</w:t>
+          <w:t>56</w:t>
         </w:r>
         <w:r>
           <w:rPr/>

</xml_diff>